<commit_message>
results update after bug
</commit_message>
<xml_diff>
--- a/paper/livingSEBpaper.docx
+++ b/paper/livingSEBpaper.docx
@@ -2525,7 +2525,7 @@
         <w:pStyle w:val="FirstParagraph"/>
       </w:pPr>
       <w:r>
-        <w:t xml:space="preserve">At the time of writing, the systematic search identified 259 publications (Scopus = 136; WOS = 123). After removing duplicates, screening titles and abstracts, and reviewing full texts, 30 studies were retained for the living review and 19 studies met criteria for quantitative synthesis. These include a total of 26 independent samples (see</w:t>
+        <w:t xml:space="preserve">At the time of writing, the systematic search identified 356 publications (Scopus = 187; WOS = 169). After removing duplicates, screening titles and abstracts, and reviewing full texts, 30 studies were retained for the living review and 19 studies met criteria for quantitative synthesis. These include a total of 26 independent samples (see</w:t>
       </w:r>
       <w:r>
         <w:t xml:space="preserve"> </w:t>
@@ -2539,7 +2539,7 @@
         </w:r>
       </w:hyperlink>
       <w:r>
-        <w:t xml:space="preserve">), with sample sizes ranging from 137 to 5075 (median = 549.5). Main characteristics of all studies included in the review are reported in</w:t>
+        <w:t xml:space="preserve">), with sample sizes ranging from 137 to 5075 (median = 621). Main characteristics of all studies included in the review are reported in</w:t>
       </w:r>
       <w:r>
         <w:t xml:space="preserve"> </w:t>
@@ -2561,7 +2561,7 @@
         <w:pStyle w:val="BodyText"/>
       </w:pPr>
       <w:r>
-        <w:t xml:space="preserve">Across these studies, a total of 17329 correlation coefficients were coded, representing 5850 unique pairwise associations. Of these, 14360 correlations (3857 unique associations) involved at least one SEB domain or facet measured with a BESSI instrument. This provides the foundation for both the living database and the illustrative analyses reported below.</w:t>
+        <w:t xml:space="preserve">Across these studies, a total of 17221 correlation coefficients were coded, representing 5850 unique pairwise associations. Of these, 14292 correlations (3857 unique associations) involved at least one SEB domain or facet measured with a BESSI instrument. This provides the foundation for both the living database and the illustrative analyses reported below.</w:t>
       </w:r>
     </w:p>
     <w:p>
@@ -2667,7 +2667,7 @@
         <w:pStyle w:val="BodyText"/>
       </w:pPr>
       <w:r>
-        <w:t xml:space="preserve">A total of 55 effect sizes from 9 studies and 10 samples were included. For each SEB domain, the median available sample size was 752 (minimum sample size = 319; maximum sample size = 5075).</w:t>
+        <w:t xml:space="preserve">A total of 50 effect sizes from 9 studies and 10 samples were included. For each SEB domain, the median available sample size was 796 (minimum sample size = 319; maximum sample size = 5075).</w:t>
       </w:r>
     </w:p>
     <w:p>
@@ -2706,7 +2706,7 @@
         </w:r>
       </w:hyperlink>
       <w:r>
-        <w:t xml:space="preserve">. Of the five meta-analysed correlations with academic achievement, four were larger than 0.10, with significant effects (p &lt; 0.01) ranging between 0.1 (i.e., Cooperation) and 0.24 (i.e., Cooperation).</w:t>
+        <w:t xml:space="preserve">. Of the five meta-analysed correlations with academic achievement, four were larger than 0.10, with significant effects (p &lt; 0.01) ranging between 0.1 (i.e., Cooperation) and 0.24 (i.e., Self-management).</w:t>
       </w:r>
     </w:p>
     <w:p>
@@ -2730,7 +2730,7 @@
         <w:t xml:space="preserve"> </w:t>
       </w:r>
       <w:r>
-        <w:t xml:space="preserve">test for heterogeneity shows that there is significant heterogeneity across studies, with the standard deviation of the effects ranging between 0.07 and 0.11.</w:t>
+        <w:t xml:space="preserve">test for heterogeneity shows that there is significant heterogeneity across studies, with the standard deviation of the effects ranging between 0.06 and 0.11.</w:t>
       </w:r>
     </w:p>
     <w:p>
@@ -2910,7 +2910,7 @@
         <w:pStyle w:val="BodyText"/>
       </w:pPr>
       <w:r>
-        <w:t xml:space="preserve">MASEM analyses were based on varying number of effect sizes per pairwise correlation (i.e., different correlation matrices), with the minimum available effects per correlation being 3 and the maximum being 24. As a consequence, also sample sizes and precision differed, with the minimum being 2712 (i.e., correlations between personality traits and academic achievement) and the maximum being 22911 (i.e., correlations between SEB domains). Correlation matrices were taken from 24 samples included in 17 different studies.</w:t>
+        <w:t xml:space="preserve">MASEM analyses were based on varying number of effect sizes per pairwise correlation (i.e., different correlation matrices), with the minimum available effects per correlation being 3 and the maximum being 23. As a consequence, also sample sizes and precision differed, with the minimum being 2712 (i.e., correlations between personality traits and academic achievement) and the maximum being 22592 (i.e., correlations between SEB domains). Correlation matrices were taken from 24 samples included in 17 different studies.</w:t>
       </w:r>
     </w:p>
     <w:p>
@@ -3028,7 +3028,7 @@
         <w:t xml:space="preserve"> </w:t>
       </w:r>
       <w:r>
-        <w:t xml:space="preserve">&lt; 0.01) larger than |0.1| with academic achievement beyond the corresponding trait/skill. Specifically, Innovation (b = 0.16; 95% CI [0.13; 0.2]; p &lt; 0.001), Self-management (b = 0.17; 95% CI [0.14; 0.21]; p &lt; 0.001), Social engagement (b = 0.12; 95% CI [0.08; 0.16]; p &lt; 0.001) and BF Conscientiousness (b = 0.13; 95% CI [0.08; 0.18]; p &lt; 0.001) showed significant and practically meaningful associations with academic achievement, while all other associations were lower than |0.09| and non-significant. It should be noted, however, that to estimate a complete OSMASEM model, a more refined analysis would require enlarging the research to all studies testing the association between the Big Five and academic achievement to produce better estimates of the covariance between the Big Five themselves and academic achievement and possibly obtain more precise estimates and lower convergence issues.</w:t>
+        <w:t xml:space="preserve">&lt; 0.01) larger than |0.1| with academic achievement beyond the corresponding trait/skill. Specifically, Innovation (b = 0.16; 95% CI [0.12; 0.2]; p &lt; 0.001), Self-management (b = 0.17; 95% CI [0.13; 0.21]; p &lt; 0.001), Social engagement (b = 0.12; 95% CI [0.07; 0.16]; p &lt; 0.001) and BF Conscientiousness (b = 0.13; 95% CI [0.08; 0.18]; p &lt; 0.001) showed significant and practically meaningful associations with academic achievement, while all other associations were lower than |0.08| and non-significant. It should be noted, however, that to estimate a complete OSMASEM model, a more refined analysis would require enlarging the research to all studies testing the association between the Big Five and academic achievement to produce better estimates of the covariance between the Big Five themselves and academic achievement and possibly obtain more precise estimates and lower convergence issues.</w:t>
       </w:r>
     </w:p>
     <w:p>
@@ -3105,7 +3105,7 @@
         <w:t xml:space="preserve"> </w:t>
       </w:r>
       <w:r>
-        <w:t xml:space="preserve">&lt; 0.01) larger than |0.1| with academic achievement beyond the other skill domains. Specifically, Emotional resilience (b = -0.11; 95% CI [-0.13; -0.09]; p &lt; 0.001), Self-management (b = 0.24; 95% CI [0.22; 0.25]; p &lt; 0.001) showed significant and practically meaningful associations with academic achievement, while all other associations were lower than |0.05| and/or non-significant.</w:t>
+        <w:t xml:space="preserve">&lt; 0.01) larger than |0.1| with academic achievement beyond the other skill domains. Specifically, Emotional resilience (b = -0.11; 95% CI [-0.13; -0.09]; p &lt; 0.001), Self-management (b = 0.24; 95% CI [0.22; 0.25]; p &lt; 0.001) showed significant and practically meaningful associations with academic achievement, while all other associations were lower than |0.06| and/or non-significant.</w:t>
       </w:r>
     </w:p>
     <w:bookmarkEnd w:id="56"/>
@@ -3229,7 +3229,7 @@
         <w:t xml:space="preserve">Living SEB App</w:t>
       </w:r>
       <w:r>
-        <w:t xml:space="preserve">, namely three-level meta-analysis of correlation coefficients and MASEM. The results of these analyses showed that five skills were significantly associated with academic achievement, with pooled correlations ranging between 0.07 (i.e., Emotional resilience) and 0.24 (i.e., Cooperation). When controlling for personality traits in OSMASEM regression models, three of the SEB skills and one of the personality traits showed significant association with academic achievement larger than |0.1| beyond the corresponding trait/skill. More precise estimates of these associations will be available each month in the living version of this manuscript if new research on the topic is published.</w:t>
+        <w:t xml:space="preserve">, namely three-level meta-analysis of correlation coefficients and MASEM. The results of these analyses showed that five skills were significantly associated with academic achievement, with pooled correlations ranging between 0.06 (i.e., Emotional resilience) and 0.24 (i.e., Cooperation). When controlling for personality traits in OSMASEM regression models, three of the SEB skills and one of the personality traits showed significant association with academic achievement larger than |0.1| beyond the corresponding trait/skill. More precise estimates of these associations will be available each month in the living version of this manuscript if new research on the topic is published.</w:t>
       </w:r>
     </w:p>
     <w:p>
@@ -8596,7 +8596,7 @@
         <w:gridCol w:w="1297"/>
         <w:gridCol w:w="1370"/>
         <w:gridCol w:w="796"/>
-        <w:gridCol w:w="1162"/>
+        <w:gridCol w:w="1052"/>
         <w:gridCol w:w="796"/>
       </w:tblGrid>
       <w:tr>
@@ -9127,7 +9127,7 @@
                 <w:szCs w:val="22"/>
                 <w:color w:val="000000"/>
               </w:rPr>
-              <w:t xml:space="preserve">12991 (11)</w:t>
+              <w:t xml:space="preserve">12672 (10)</w:t>
             </w:r>
           </w:p>
         </w:tc>
@@ -9283,7 +9283,7 @@
                 <w:szCs w:val="22"/>
                 <w:color w:val="000000"/>
               </w:rPr>
-              <w:t xml:space="preserve">-0.11; 0.31</w:t>
+              <w:t xml:space="preserve">-0.10; 0.29</w:t>
             </w:r>
           </w:p>
         </w:tc>
@@ -9387,7 +9387,7 @@
                 <w:szCs w:val="22"/>
                 <w:color w:val="000000"/>
               </w:rPr>
-              <w:t xml:space="preserve">62 (10)*</w:t>
+              <w:t xml:space="preserve">48 (9)*</w:t>
             </w:r>
           </w:p>
         </w:tc>
@@ -9549,7 +9549,7 @@
                 <w:szCs w:val="22"/>
                 <w:color w:val="000000"/>
               </w:rPr>
-              <w:t xml:space="preserve">12991 (11)</w:t>
+              <w:t xml:space="preserve">12672 (10)</w:t>
             </w:r>
           </w:p>
         </w:tc>
@@ -9601,7 +9601,7 @@
                 <w:szCs w:val="22"/>
                 <w:color w:val="000000"/>
               </w:rPr>
-              <w:t xml:space="preserve">0.07*</w:t>
+              <w:t xml:space="preserve">0.06*</w:t>
             </w:r>
           </w:p>
         </w:tc>
@@ -9653,7 +9653,7 @@
                 <w:szCs w:val="22"/>
                 <w:color w:val="000000"/>
               </w:rPr>
-              <w:t xml:space="preserve">0.01; 0.13</w:t>
+              <w:t xml:space="preserve">0.01; 0.11</w:t>
             </w:r>
           </w:p>
         </w:tc>
@@ -9705,7 +9705,7 @@
                 <w:szCs w:val="22"/>
                 <w:color w:val="000000"/>
               </w:rPr>
-              <w:t xml:space="preserve">-0.11; 0.24</w:t>
+              <w:t xml:space="preserve">-0.08; 0.20</w:t>
             </w:r>
           </w:p>
         </w:tc>
@@ -9757,7 +9757,7 @@
                 <w:szCs w:val="22"/>
                 <w:color w:val="000000"/>
               </w:rPr>
-              <w:t xml:space="preserve">0.03</w:t>
+              <w:t xml:space="preserve">0.02</w:t>
             </w:r>
           </w:p>
         </w:tc>
@@ -9809,7 +9809,7 @@
                 <w:szCs w:val="22"/>
                 <w:color w:val="000000"/>
               </w:rPr>
-              <w:t xml:space="preserve">39 (10)*</w:t>
+              <w:t xml:space="preserve">24 (9)*</w:t>
             </w:r>
           </w:p>
         </w:tc>
@@ -9861,7 +9861,7 @@
                 <w:szCs w:val="22"/>
                 <w:color w:val="000000"/>
               </w:rPr>
-              <w:t xml:space="preserve">0.01</w:t>
+              <w:t xml:space="preserve">0.00</w:t>
             </w:r>
           </w:p>
         </w:tc>
@@ -9971,7 +9971,7 @@
                 <w:szCs w:val="22"/>
                 <w:color w:val="000000"/>
               </w:rPr>
-              <w:t xml:space="preserve">12991 (11)</w:t>
+              <w:t xml:space="preserve">12672 (10)</w:t>
             </w:r>
           </w:p>
         </w:tc>
@@ -10231,7 +10231,7 @@
                 <w:szCs w:val="22"/>
                 <w:color w:val="000000"/>
               </w:rPr>
-              <w:t xml:space="preserve">91 (10)*</w:t>
+              <w:t xml:space="preserve">86 (9)*</w:t>
             </w:r>
           </w:p>
         </w:tc>
@@ -10393,7 +10393,7 @@
                 <w:szCs w:val="22"/>
                 <w:color w:val="000000"/>
               </w:rPr>
-              <w:t xml:space="preserve">12991 (11)</w:t>
+              <w:t xml:space="preserve">12672 (10)</w:t>
             </w:r>
           </w:p>
         </w:tc>
@@ -10497,7 +10497,7 @@
                 <w:szCs w:val="22"/>
                 <w:color w:val="000000"/>
               </w:rPr>
-              <w:t xml:space="preserve">0.18; 0.31</w:t>
+              <w:t xml:space="preserve">0.18; 0.30</w:t>
             </w:r>
           </w:p>
         </w:tc>
@@ -10549,7 +10549,7 @@
                 <w:szCs w:val="22"/>
                 <w:color w:val="000000"/>
               </w:rPr>
-              <w:t xml:space="preserve"> 0.04; 0.43</w:t>
+              <w:t xml:space="preserve"> 0.04; 0.42</w:t>
             </w:r>
           </w:p>
         </w:tc>
@@ -10653,7 +10653,7 @@
                 <w:szCs w:val="22"/>
                 <w:color w:val="000000"/>
               </w:rPr>
-              <w:t xml:space="preserve">67 (10)*</w:t>
+              <w:t xml:space="preserve">59 (9)*</w:t>
             </w:r>
           </w:p>
         </w:tc>
@@ -10815,7 +10815,7 @@
                 <w:szCs w:val="22"/>
                 <w:color w:val="000000"/>
               </w:rPr>
-              <w:t xml:space="preserve">12991 (11)</w:t>
+              <w:t xml:space="preserve">12672 (10)</w:t>
             </w:r>
           </w:p>
         </w:tc>
@@ -10919,7 +10919,7 @@
                 <w:szCs w:val="22"/>
                 <w:color w:val="000000"/>
               </w:rPr>
-              <w:t xml:space="preserve">0.04; 0.18</w:t>
+              <w:t xml:space="preserve">0.04; 0.17</w:t>
             </w:r>
           </w:p>
         </w:tc>
@@ -10971,7 +10971,7 @@
                 <w:szCs w:val="22"/>
                 <w:color w:val="000000"/>
               </w:rPr>
-              <w:t xml:space="preserve">-0.10; 0.31</w:t>
+              <w:t xml:space="preserve">-0.08; 0.29</w:t>
             </w:r>
           </w:p>
         </w:tc>
@@ -11075,7 +11075,7 @@
                 <w:szCs w:val="22"/>
                 <w:color w:val="000000"/>
               </w:rPr>
-              <w:t xml:space="preserve">56 (10)*</w:t>
+              <w:t xml:space="preserve">38 (9)*</w:t>
             </w:r>
           </w:p>
         </w:tc>
@@ -11814,7 +11814,7 @@
                 <w:szCs w:val="20"/>
                 <w:color w:val="000000"/>
               </w:rPr>
-              <w:t xml:space="preserve">-0.064*</w:t>
+              <w:t xml:space="preserve">-0.065*</w:t>
             </w:r>
           </w:p>
         </w:tc>
@@ -11918,7 +11918,7 @@
                 <w:szCs w:val="20"/>
                 <w:color w:val="000000"/>
               </w:rPr>
-              <w:t xml:space="preserve">[-0.11; -0.01]</w:t>
+              <w:t xml:space="preserve">[-0.11; -0.02]</w:t>
             </w:r>
           </w:p>
         </w:tc>
@@ -11970,7 +11970,7 @@
                 <w:szCs w:val="20"/>
                 <w:color w:val="000000"/>
               </w:rPr>
-              <w:t xml:space="preserve">-2.54</w:t>
+              <w:t xml:space="preserve">-2.55</w:t>
             </w:r>
           </w:p>
         </w:tc>
@@ -12184,7 +12184,7 @@
                 <w:szCs w:val="20"/>
                 <w:color w:val="000000"/>
               </w:rPr>
-              <w:t xml:space="preserve">0.163***</w:t>
+              <w:t xml:space="preserve">0.16***</w:t>
             </w:r>
           </w:p>
         </w:tc>
@@ -12288,7 +12288,7 @@
                 <w:szCs w:val="20"/>
                 <w:color w:val="000000"/>
               </w:rPr>
-              <w:t xml:space="preserve">[0.13; 0.2]</w:t>
+              <w:t xml:space="preserve">[0.12; 0.2]</w:t>
             </w:r>
           </w:p>
         </w:tc>
@@ -12340,7 +12340,7 @@
                 <w:szCs w:val="20"/>
                 <w:color w:val="000000"/>
               </w:rPr>
-              <w:t xml:space="preserve">8.59</w:t>
+              <w:t xml:space="preserve">8.40</w:t>
             </w:r>
           </w:p>
         </w:tc>
@@ -13294,7 +13294,7 @@
                 <w:szCs w:val="20"/>
                 <w:color w:val="000000"/>
               </w:rPr>
-              <w:t xml:space="preserve">0.175***</w:t>
+              <w:t xml:space="preserve">0.172***</w:t>
             </w:r>
           </w:p>
         </w:tc>
@@ -13398,7 +13398,7 @@
                 <w:szCs w:val="20"/>
                 <w:color w:val="000000"/>
               </w:rPr>
-              <w:t xml:space="preserve">[0.14; 0.21]</w:t>
+              <w:t xml:space="preserve">[0.13; 0.21]</w:t>
             </w:r>
           </w:p>
         </w:tc>
@@ -13450,7 +13450,7 @@
                 <w:szCs w:val="20"/>
                 <w:color w:val="000000"/>
               </w:rPr>
-              <w:t xml:space="preserve">8.89</w:t>
+              <w:t xml:space="preserve">8.67</w:t>
             </w:r>
           </w:p>
         </w:tc>
@@ -14034,7 +14034,7 @@
                 <w:szCs w:val="20"/>
                 <w:color w:val="000000"/>
               </w:rPr>
-              <w:t xml:space="preserve">-0.022</w:t>
+              <w:t xml:space="preserve">-0.02</w:t>
             </w:r>
           </w:p>
         </w:tc>
@@ -14138,7 +14138,7 @@
                 <w:szCs w:val="20"/>
                 <w:color w:val="000000"/>
               </w:rPr>
-              <w:t xml:space="preserve">[-0.08; 0.03]</w:t>
+              <w:t xml:space="preserve">[-0.07; 0.03]</w:t>
             </w:r>
           </w:p>
         </w:tc>
@@ -14190,7 +14190,7 @@
                 <w:szCs w:val="20"/>
                 <w:color w:val="000000"/>
               </w:rPr>
-              <w:t xml:space="preserve">-0.79</w:t>
+              <w:t xml:space="preserve">-0.71</w:t>
             </w:r>
           </w:p>
         </w:tc>
@@ -14404,7 +14404,7 @@
                 <w:szCs w:val="20"/>
                 <w:color w:val="000000"/>
               </w:rPr>
-              <w:t xml:space="preserve">0.122***</w:t>
+              <w:t xml:space="preserve">0.115***</w:t>
             </w:r>
           </w:p>
         </w:tc>
@@ -14508,7 +14508,7 @@
                 <w:szCs w:val="20"/>
                 <w:color w:val="000000"/>
               </w:rPr>
-              <w:t xml:space="preserve">[0.08; 0.16]</w:t>
+              <w:t xml:space="preserve">[0.07; 0.16]</w:t>
             </w:r>
           </w:p>
         </w:tc>
@@ -14560,7 +14560,7 @@
                 <w:szCs w:val="20"/>
                 <w:color w:val="000000"/>
               </w:rPr>
-              <w:t xml:space="preserve">5.70</w:t>
+              <w:t xml:space="preserve">5.34</w:t>
             </w:r>
           </w:p>
         </w:tc>
@@ -15300,7 +15300,7 @@
                 <w:szCs w:val="20"/>
                 <w:color w:val="000000"/>
               </w:rPr>
-              <w:t xml:space="preserve">2.80</w:t>
+              <w:t xml:space="preserve">2.82</w:t>
             </w:r>
           </w:p>
         </w:tc>
@@ -15514,7 +15514,7 @@
                 <w:szCs w:val="20"/>
                 <w:color w:val="000000"/>
               </w:rPr>
-              <w:t xml:space="preserve">0.057***</w:t>
+              <w:t xml:space="preserve">0.051**</w:t>
             </w:r>
           </w:p>
         </w:tc>
@@ -15618,7 +15618,7 @@
                 <w:szCs w:val="20"/>
                 <w:color w:val="000000"/>
               </w:rPr>
-              <w:t xml:space="preserve">[0.02; 0.09]</w:t>
+              <w:t xml:space="preserve">[0.02; 0.08]</w:t>
             </w:r>
           </w:p>
         </w:tc>
@@ -15670,7 +15670,7 @@
                 <w:szCs w:val="20"/>
                 <w:color w:val="000000"/>
               </w:rPr>
-              <w:t xml:space="preserve">3.42</w:t>
+              <w:t xml:space="preserve">3.08</w:t>
             </w:r>
           </w:p>
         </w:tc>
@@ -16254,7 +16254,7 @@
                 <w:szCs w:val="20"/>
                 <w:color w:val="000000"/>
               </w:rPr>
-              <w:t xml:space="preserve">0.056*</w:t>
+              <w:t xml:space="preserve">0.055*</w:t>
             </w:r>
           </w:p>
         </w:tc>
@@ -16410,7 +16410,7 @@
                 <w:szCs w:val="20"/>
                 <w:color w:val="000000"/>
               </w:rPr>
-              <w:t xml:space="preserve">2.13</w:t>
+              <w:t xml:space="preserve">2.10</w:t>
             </w:r>
           </w:p>
         </w:tc>
@@ -16624,7 +16624,7 @@
                 <w:szCs w:val="20"/>
                 <w:color w:val="000000"/>
               </w:rPr>
-              <w:t xml:space="preserve">0.089***</w:t>
+              <w:t xml:space="preserve">0.083***</w:t>
             </w:r>
           </w:p>
         </w:tc>
@@ -16728,7 +16728,7 @@
                 <w:szCs w:val="20"/>
                 <w:color w:val="000000"/>
               </w:rPr>
-              <w:t xml:space="preserve">[0.05; 0.13]</w:t>
+              <w:t xml:space="preserve">[0.04; 0.12]</w:t>
             </w:r>
           </w:p>
         </w:tc>
@@ -16780,7 +16780,7 @@
                 <w:szCs w:val="20"/>
                 <w:color w:val="000000"/>
               </w:rPr>
-              <w:t xml:space="preserve">4.44</w:t>
+              <w:t xml:space="preserve">4.14</w:t>
             </w:r>
           </w:p>
         </w:tc>
@@ -17150,7 +17150,7 @@
                 <w:szCs w:val="20"/>
                 <w:color w:val="000000"/>
               </w:rPr>
-              <w:t xml:space="preserve">-115.34</w:t>
+              <w:t xml:space="preserve">-115.35</w:t>
             </w:r>
           </w:p>
         </w:tc>
@@ -17837,7 +17837,7 @@
                 <w:szCs w:val="20"/>
                 <w:color w:val="000000"/>
               </w:rPr>
-              <w:t xml:space="preserve">-0.052***</w:t>
+              <w:t xml:space="preserve">-0.055***</w:t>
             </w:r>
           </w:p>
         </w:tc>
@@ -17993,7 +17993,7 @@
                 <w:szCs w:val="20"/>
                 <w:color w:val="000000"/>
               </w:rPr>
-              <w:t xml:space="preserve">-6.23</w:t>
+              <w:t xml:space="preserve">-6.41</w:t>
             </w:r>
           </w:p>
         </w:tc>
@@ -18207,7 +18207,7 @@
                 <w:szCs w:val="20"/>
                 <w:color w:val="000000"/>
               </w:rPr>
-              <w:t xml:space="preserve">-0.109***</w:t>
+              <w:t xml:space="preserve">-0.11***</w:t>
             </w:r>
           </w:p>
         </w:tc>
@@ -18363,7 +18363,7 @@
                 <w:szCs w:val="20"/>
                 <w:color w:val="000000"/>
               </w:rPr>
-              <w:t xml:space="preserve">-12.87</w:t>
+              <w:t xml:space="preserve">-12.89</w:t>
             </w:r>
           </w:p>
         </w:tc>
@@ -18577,7 +18577,7 @@
                 <w:szCs w:val="20"/>
                 <w:color w:val="000000"/>
               </w:rPr>
-              <w:t xml:space="preserve">0.013</w:t>
+              <w:t xml:space="preserve">0.015</w:t>
             </w:r>
           </w:p>
         </w:tc>
@@ -18733,7 +18733,7 @@
                 <w:szCs w:val="20"/>
                 <w:color w:val="000000"/>
               </w:rPr>
-              <w:t xml:space="preserve">1.61</w:t>
+              <w:t xml:space="preserve">1.75</w:t>
             </w:r>
           </w:p>
         </w:tc>
@@ -18947,7 +18947,7 @@
                 <w:szCs w:val="20"/>
                 <w:color w:val="000000"/>
               </w:rPr>
-              <w:t xml:space="preserve">0.237***</w:t>
+              <w:t xml:space="preserve">0.238***</w:t>
             </w:r>
           </w:p>
         </w:tc>
@@ -19103,7 +19103,7 @@
                 <w:szCs w:val="20"/>
                 <w:color w:val="000000"/>
               </w:rPr>
-              <w:t xml:space="preserve">29.18</w:t>
+              <w:t xml:space="preserve">28.88</w:t>
             </w:r>
           </w:p>
         </w:tc>
@@ -19317,7 +19317,7 @@
                 <w:szCs w:val="20"/>
                 <w:color w:val="000000"/>
               </w:rPr>
-              <w:t xml:space="preserve">-0.012</w:t>
+              <w:t xml:space="preserve">-0.013</w:t>
             </w:r>
           </w:p>
         </w:tc>
@@ -19473,7 +19473,7 @@
                 <w:szCs w:val="20"/>
                 <w:color w:val="000000"/>
               </w:rPr>
-              <w:t xml:space="preserve">-1.40</w:t>
+              <w:t xml:space="preserve">-1.57</w:t>
             </w:r>
           </w:p>
         </w:tc>

</xml_diff>

<commit_message>
paper update after rev 2
</commit_message>
<xml_diff>
--- a/paper/livingSEBpaper.docx
+++ b/paper/livingSEBpaper.docx
@@ -68,7 +68,7 @@
       </w:r>
     </w:p>
     <w:bookmarkEnd w:id="20"/>
-    <w:bookmarkStart w:id="38" w:name="author-note"/>
+    <w:bookmarkStart w:id="35" w:name="author-note"/>
     <w:p>
       <w:pPr>
         <w:pStyle w:val="Heading1"/>
@@ -87,7 +87,7 @@
       <w:r>
         <w:t xml:space="preserve"> </w:t>
       </w:r>
-      <w:bookmarkStart w:id="25" w:name="orchid"/>
+      <w:bookmarkStart w:id="24" w:name="orchid"/>
       <w:r>
         <w:drawing>
           <wp:inline>
@@ -104,7 +104,7 @@
                     </pic:cNvPicPr>
                   </pic:nvPicPr>
                   <pic:blipFill>
-                    <a:blip r:embed="rId24">
+                    <a:blip>
                       <a:extLst>
                         <a:ext uri="{28A0092B-C50C-407E-A947-70E740481C1C}">
                           <a14:useLocalDpi xmlns:a14="http://schemas.microsoft.com/office/drawing/2010/main" val="0"/>
@@ -139,11 +139,11 @@
           </wp:inline>
         </w:drawing>
       </w:r>
-      <w:bookmarkEnd w:id="25"/>
-      <w:r>
-        <w:t xml:space="preserve"> </w:t>
-      </w:r>
-      <w:hyperlink r:id="rId26">
+      <w:bookmarkEnd w:id="24"/>
+      <w:r>
+        <w:t xml:space="preserve"> </w:t>
+      </w:r>
+      <w:hyperlink r:id="rId25">
         <w:r>
           <w:rPr>
             <w:rStyle w:val="Hyperlink"/>
@@ -162,24 +162,24 @@
       <w:r>
         <w:t xml:space="preserve"> </w:t>
       </w:r>
-      <w:bookmarkStart w:id="30" w:name="orchid"/>
+      <w:bookmarkStart w:id="28" w:name="orchid"/>
       <w:r>
         <w:drawing>
           <wp:inline>
             <wp:extent cx="152279" cy="152279"/>
             <wp:effectExtent b="0" l="0" r="0" t="0"/>
-            <wp:docPr descr="Orcid ID Logo: A green circle with white letters ID" title="" id="27" name="Picture"/>
+            <wp:docPr descr="Orcid ID Logo: A green circle with white letters ID" title="" id="26" name="Picture"/>
             <a:graphic>
               <a:graphicData uri="http://schemas.openxmlformats.org/drawingml/2006/picture">
                 <pic:pic>
                   <pic:nvPicPr>
-                    <pic:cNvPr descr="_extensions/wjschne/apaquarto/ORCID-iD_icon-vector.svg" id="28" name="Picture"/>
+                    <pic:cNvPr descr="_extensions/wjschne/apaquarto/ORCID-iD_icon-vector.svg" id="27" name="Picture"/>
                     <pic:cNvPicPr>
                       <a:picLocks noChangeArrowheads="1" noChangeAspect="1"/>
                     </pic:cNvPicPr>
                   </pic:nvPicPr>
                   <pic:blipFill>
-                    <a:blip r:embed="rId29">
+                    <a:blip>
                       <a:extLst>
                         <a:ext uri="{28A0092B-C50C-407E-A947-70E740481C1C}">
                           <a14:useLocalDpi xmlns:a14="http://schemas.microsoft.com/office/drawing/2010/main" val="0"/>
@@ -214,11 +214,11 @@
           </wp:inline>
         </w:drawing>
       </w:r>
-      <w:bookmarkEnd w:id="30"/>
-      <w:r>
-        <w:t xml:space="preserve"> </w:t>
-      </w:r>
-      <w:hyperlink r:id="rId31">
+      <w:bookmarkEnd w:id="28"/>
+      <w:r>
+        <w:t xml:space="preserve"> </w:t>
+      </w:r>
+      <w:hyperlink r:id="rId29">
         <w:r>
           <w:rPr>
             <w:rStyle w:val="Hyperlink"/>
@@ -237,24 +237,24 @@
       <w:r>
         <w:t xml:space="preserve"> </w:t>
       </w:r>
-      <w:bookmarkStart w:id="35" w:name="orchid"/>
+      <w:bookmarkStart w:id="32" w:name="orchid"/>
       <w:r>
         <w:drawing>
           <wp:inline>
             <wp:extent cx="152279" cy="152279"/>
             <wp:effectExtent b="0" l="0" r="0" t="0"/>
-            <wp:docPr descr="Orcid ID Logo: A green circle with white letters ID" title="" id="32" name="Picture"/>
+            <wp:docPr descr="Orcid ID Logo: A green circle with white letters ID" title="" id="30" name="Picture"/>
             <a:graphic>
               <a:graphicData uri="http://schemas.openxmlformats.org/drawingml/2006/picture">
                 <pic:pic>
                   <pic:nvPicPr>
-                    <pic:cNvPr descr="_extensions/wjschne/apaquarto/ORCID-iD_icon-vector.svg" id="33" name="Picture"/>
+                    <pic:cNvPr descr="_extensions/wjschne/apaquarto/ORCID-iD_icon-vector.svg" id="31" name="Picture"/>
                     <pic:cNvPicPr>
                       <a:picLocks noChangeArrowheads="1" noChangeAspect="1"/>
                     </pic:cNvPicPr>
                   </pic:nvPicPr>
                   <pic:blipFill>
-                    <a:blip r:embed="rId34">
+                    <a:blip>
                       <a:extLst>
                         <a:ext uri="{28A0092B-C50C-407E-A947-70E740481C1C}">
                           <a14:useLocalDpi xmlns:a14="http://schemas.microsoft.com/office/drawing/2010/main" val="0"/>
@@ -289,11 +289,11 @@
           </wp:inline>
         </w:drawing>
       </w:r>
-      <w:bookmarkEnd w:id="35"/>
-      <w:r>
-        <w:t xml:space="preserve"> </w:t>
-      </w:r>
-      <w:hyperlink r:id="rId36">
+      <w:bookmarkEnd w:id="32"/>
+      <w:r>
+        <w:t xml:space="preserve"> </w:t>
+      </w:r>
+      <w:hyperlink r:id="rId33">
         <w:r>
           <w:rPr>
             <w:rStyle w:val="Hyperlink"/>
@@ -320,7 +320,7 @@
       <w:r>
         <w:t xml:space="preserve"> </w:t>
       </w:r>
-      <w:hyperlink r:id="rId37">
+      <w:hyperlink r:id="rId34">
         <w:r>
           <w:rPr>
             <w:rStyle w:val="Hyperlink"/>
@@ -334,8 +334,8 @@
         <w:br w:type="page"/>
       </w:r>
     </w:p>
-    <w:bookmarkEnd w:id="38"/>
-    <w:bookmarkStart w:id="39" w:name="abstract"/>
+    <w:bookmarkEnd w:id="35"/>
+    <w:bookmarkStart w:id="36" w:name="abstract"/>
     <w:p>
       <w:pPr>
         <w:pStyle w:val="Heading1"/>
@@ -372,8 +372,8 @@
         <w:br w:type="page"/>
       </w:r>
     </w:p>
-    <w:bookmarkEnd w:id="39"/>
-    <w:bookmarkStart w:id="40" w:name="firstheader"/>
+    <w:bookmarkEnd w:id="36"/>
+    <w:bookmarkStart w:id="37" w:name="firstheader"/>
     <w:p>
       <w:pPr>
         <w:pStyle w:val="Heading1"/>
@@ -382,8 +382,8 @@
         <w:t xml:space="preserve">The Living SEB Skills Project: A Living Resource for Review and Meta-Analysis of Social, Emotional, and Behavioral Skills</w:t>
       </w:r>
     </w:p>
-    <w:bookmarkEnd w:id="40"/>
-    <w:bookmarkStart w:id="44" w:name="introduction"/>
+    <w:bookmarkEnd w:id="37"/>
+    <w:bookmarkStart w:id="41" w:name="introduction"/>
     <w:p>
       <w:pPr>
         <w:pStyle w:val="Heading1"/>
@@ -725,7 +725,7 @@
         <w:t xml:space="preserve">Our overarching goal is to prevent SEB skills research from repeating the familiar cycle of selective reporting, fragmentation, and stagnation of many different fields in psychology.</w:t>
       </w:r>
     </w:p>
-    <w:bookmarkStart w:id="41" w:name="social-emotional-and-behavioral-skills"/>
+    <w:bookmarkStart w:id="38" w:name="social-emotional-and-behavioral-skills"/>
     <w:p>
       <w:pPr>
         <w:pStyle w:val="Heading2"/>
@@ -1205,8 +1205,8 @@
         <w:t xml:space="preserve">. In such a rapidly developing area, relying on static reviews or individual literature searches risks selective citation, cherry-picking of results, and conceptual fragmentation. To mitigate these risks, we propose a living and cumulative approach to synthesizing SEB research.</w:t>
       </w:r>
     </w:p>
-    <w:bookmarkEnd w:id="41"/>
-    <w:bookmarkStart w:id="42" w:name="Xc7cba48d50cd7563d163a90e63d0996436d7571"/>
+    <w:bookmarkEnd w:id="38"/>
+    <w:bookmarkStart w:id="39" w:name="Xc7cba48d50cd7563d163a90e63d0996436d7571"/>
     <w:p>
       <w:pPr>
         <w:pStyle w:val="Heading2"/>
@@ -1442,8 +1442,8 @@
         <w:t xml:space="preserve">Providing a similar tool would speed up and facilitate researchers’ literature search, support a standardized and evidence-based understanding of the literature, and inform future research. Given the recency of the framework, fragmentation risks, and rapid expansion of this new research area, SEB skills represent an ideal case for introducing a living review system.</w:t>
       </w:r>
     </w:p>
-    <w:bookmarkEnd w:id="42"/>
-    <w:bookmarkStart w:id="43" w:name="rationale-aims-and-hypotheses"/>
+    <w:bookmarkEnd w:id="39"/>
+    <w:bookmarkStart w:id="40" w:name="rationale-aims-and-hypotheses"/>
     <w:p>
       <w:pPr>
         <w:pStyle w:val="Heading2"/>
@@ -1600,9 +1600,9 @@
         <w:t xml:space="preserve">to date. In particular, we use both multilevel meta-analysis of correlations and meta-analytic structural equation modeling (MASEM)..</w:t>
       </w:r>
     </w:p>
-    <w:bookmarkEnd w:id="43"/>
-    <w:bookmarkEnd w:id="44"/>
-    <w:bookmarkStart w:id="55" w:name="methods"/>
+    <w:bookmarkEnd w:id="40"/>
+    <w:bookmarkEnd w:id="41"/>
+    <w:bookmarkStart w:id="52" w:name="methods"/>
     <w:p>
       <w:pPr>
         <w:pStyle w:val="Heading1"/>
@@ -1611,7 +1611,7 @@
         <w:t xml:space="preserve">Methods</w:t>
       </w:r>
     </w:p>
-    <w:bookmarkStart w:id="48" w:name="transparency-and-openness"/>
+    <w:bookmarkStart w:id="45" w:name="transparency-and-openness"/>
     <w:p>
       <w:pPr>
         <w:pStyle w:val="Heading2"/>
@@ -1630,7 +1630,7 @@
       <w:r>
         <w:t xml:space="preserve"> </w:t>
       </w:r>
-      <w:hyperlink r:id="rId45">
+      <w:hyperlink r:id="rId42">
         <w:r>
           <w:rPr>
             <w:rStyle w:val="Hyperlink"/>
@@ -1644,7 +1644,7 @@
       <w:r>
         <w:t xml:space="preserve">. The repository (</w:t>
       </w:r>
-      <w:hyperlink r:id="rId46">
+      <w:hyperlink r:id="rId43">
         <w:r>
           <w:rPr>
             <w:rStyle w:val="Hyperlink"/>
@@ -1655,7 +1655,7 @@
       <w:r>
         <w:t xml:space="preserve">) also hosts all materials, data, and R code used in this article. All materials are also available on Zenodo (</w:t>
       </w:r>
-      <w:hyperlink r:id="rId47">
+      <w:hyperlink r:id="rId44">
         <w:r>
           <w:rPr>
             <w:rStyle w:val="Hyperlink"/>
@@ -1687,8 +1687,8 @@
         <w:t xml:space="preserve">.</w:t>
       </w:r>
     </w:p>
-    <w:bookmarkEnd w:id="48"/>
-    <w:bookmarkStart w:id="49" w:name="search-strategy"/>
+    <w:bookmarkEnd w:id="45"/>
+    <w:bookmarkStart w:id="46" w:name="search-strategy"/>
     <w:p>
       <w:pPr>
         <w:pStyle w:val="Heading2"/>
@@ -1841,8 +1841,8 @@
         <w:t xml:space="preserve">. For readability, the full search string is available in the preregistration protocol only and will be updated when new measurement or basic theoretical papers are published.</w:t>
       </w:r>
     </w:p>
-    <w:bookmarkEnd w:id="49"/>
-    <w:bookmarkStart w:id="51" w:name="study-eligibility-criteria"/>
+    <w:bookmarkEnd w:id="46"/>
+    <w:bookmarkStart w:id="48" w:name="study-eligibility-criteria"/>
     <w:p>
       <w:pPr>
         <w:pStyle w:val="Heading2"/>
@@ -1896,7 +1896,7 @@
         <w:t xml:space="preserve">)</w:t>
       </w:r>
       <w:r>
-        <w:t xml:space="preserve">, are not considered for inclusion. Similarly, studies focusing solely on other constructs are excluded even if they cite the reference papers. However, if a study examines a different construct but also collects ancillary data using the BESSI, it is included in the meta-analysis. Citations are also excluded if they are published as theses, conference abstracts, or books. Data publications are included if the data are not already included in an indexed study.</w:t>
+        <w:t xml:space="preserve">, are not considered for inclusion. Similarly, studies focusing solely on other constructs are excluded even if they cite the reference papers. However, if a study examines a different construct but also collects ancillary data using the BESSI, it is included in the meta-analysis. Publications are also excluded if they are published as theses, conference abstracts, or books. Data publications are included if the data are not already included in an indexed study.</w:t>
       </w:r>
     </w:p>
     <w:p>
@@ -1992,7 +1992,7 @@
         <w:t xml:space="preserve">The study does not report correlations at baseline or data could not be reduced to correlations.</w:t>
       </w:r>
     </w:p>
-    <w:bookmarkStart w:id="50" w:name="coding-procedures"/>
+    <w:bookmarkStart w:id="47" w:name="coding-procedures"/>
     <w:p>
       <w:pPr>
         <w:pStyle w:val="Heading3"/>
@@ -2340,9 +2340,9 @@
         <w:t xml:space="preserve">. All measures, outcomes, and correlates are manually classified within the names of the correlation matrix. A codebook with all measures coded is available on the GitHub page of the project allowing categorizations of variables in specific and broader categories.</w:t>
       </w:r>
     </w:p>
-    <w:bookmarkEnd w:id="50"/>
-    <w:bookmarkEnd w:id="51"/>
-    <w:bookmarkStart w:id="52" w:name="updating-procedures-and-timeline"/>
+    <w:bookmarkEnd w:id="47"/>
+    <w:bookmarkEnd w:id="48"/>
+    <w:bookmarkStart w:id="49" w:name="updating-procedures-and-timeline"/>
     <w:p>
       <w:pPr>
         <w:pStyle w:val="Heading2"/>
@@ -2368,7 +2368,7 @@
         <w:t xml:space="preserve"> </w:t>
       </w:r>
       <w:r>
-        <w:t xml:space="preserve">nature of the project, the search and coding procedures are repeated on the first working day of each month to keep updates feasible and avoid large, onerous updates. New studies are added to the database and version-controlled monthly snapshots are archived in GitHub and Zenodo. If no eligible studies are published within a month, no data releases will be published. When new theoretical or measurement works are published, the seed references for the citation-chaining search are expanded accordingly. Additionally, at each new search, the database search will be limited by adding the day the last search was conducted as a starting search limit. To pilot the feasibility of this procedure, we already ran the monthly updates on multiple occasions without encountering time or processing difficulties. We thus retain that the current strategy for monthly updates is feasible with current available resources.</w:t>
+        <w:t xml:space="preserve">nature of the project, the search and coding procedures are repeated on the first working day of each month to keep updates feasible and avoid large, onerous updates. New studies are added to the database and version-controlled monthly snapshots are archived in GitHub and Zenodo. If no eligible studies are published within a given month, a data release will still be issued, specifying that no new data were availablendefined. When new theoretical or measurement works are published, the seed references for the citation-chaining search are expanded accordingly. Additionally, at each new search, the database search will be limited by adding the day the last search was conducted as a starting search limit. To pilot the feasibility of this procedure, we already ran the monthly updates on multiple occasions without encountering time or processing difficulties. We thus retain that the current strategy for monthly updates is feasible with current available re</w:t>
       </w:r>
     </w:p>
     <w:p>
@@ -2379,8 +2379,8 @@
         <w:t xml:space="preserve">We currently expect to provide hand-processed monthly updates of the database until 2030, while working on expanding the collaborative efforts from the community and integrating semi-automized processes for the future.</w:t>
       </w:r>
     </w:p>
-    <w:bookmarkEnd w:id="52"/>
-    <w:bookmarkStart w:id="54" w:name="the-living-seb-app"/>
+    <w:bookmarkEnd w:id="49"/>
+    <w:bookmarkStart w:id="51" w:name="the-living-seb-app"/>
     <w:p>
       <w:pPr>
         <w:pStyle w:val="Heading2"/>
@@ -2499,7 +2499,7 @@
       <w:r>
         <w:t xml:space="preserve"> </w:t>
       </w:r>
-      <w:hyperlink r:id="rId53">
+      <w:hyperlink r:id="rId50">
         <w:r>
           <w:rPr>
             <w:rStyle w:val="Hyperlink"/>
@@ -2511,9 +2511,9 @@
         <w:t xml:space="preserve">.</w:t>
       </w:r>
     </w:p>
-    <w:bookmarkEnd w:id="54"/>
-    <w:bookmarkEnd w:id="55"/>
-    <w:bookmarkStart w:id="65" w:name="results"/>
+    <w:bookmarkEnd w:id="51"/>
+    <w:bookmarkEnd w:id="52"/>
+    <w:bookmarkStart w:id="62" w:name="results"/>
     <w:p>
       <w:pPr>
         <w:pStyle w:val="Heading1"/>
@@ -2545,7 +2545,7 @@
       <w:r>
         <w:t xml:space="preserve"> </w:t>
       </w:r>
-      <w:hyperlink r:id="rId56">
+      <w:hyperlink r:id="rId53">
         <w:r>
           <w:rPr>
             <w:rStyle w:val="Hyperlink"/>
@@ -2559,7 +2559,7 @@
       <w:r>
         <w:t xml:space="preserve"> </w:t>
       </w:r>
-      <w:hyperlink r:id="rId57">
+      <w:hyperlink r:id="rId54">
         <w:r>
           <w:rPr>
             <w:rStyle w:val="Hyperlink"/>
@@ -2571,7 +2571,7 @@
         <w:t xml:space="preserve">.</w:t>
       </w:r>
     </w:p>
-    <w:bookmarkStart w:id="58" w:name="database-overview"/>
+    <w:bookmarkStart w:id="55" w:name="database-overview"/>
     <w:p>
       <w:pPr>
         <w:pStyle w:val="Heading2"/>
@@ -2585,7 +2585,7 @@
         <w:pStyle w:val="FirstParagraph"/>
       </w:pPr>
       <w:r>
-        <w:t xml:space="preserve">At the time of writing, the systematic search identified 441 publications (Scopus = 252; WOS = 189). After removing duplicates, screening titles and abstracts, and reviewing full texts, 35 studies were retained for the living review and 21 studies met criteria for quantitative synthesis. These include a total of 28 independent samples (see</w:t>
+        <w:t xml:space="preserve">At the time of writing, the systematic search identified 356 publications (Scopus = 187; WOS = 169). After removing duplicates, screening titles and abstracts, and reviewing full texts, 35 studies were retained for the living review and 21 studies met criteria for quantitative synthesis. These include a total of 28 independent samples (see</w:t>
       </w:r>
       <w:r>
         <w:t xml:space="preserve"> </w:t>
@@ -2618,7 +2618,7 @@
       <w:r>
         <w:t xml:space="preserve"> </w:t>
       </w:r>
-      <w:hyperlink r:id="rId56">
+      <w:hyperlink r:id="rId53">
         <w:r>
           <w:rPr>
             <w:rStyle w:val="Hyperlink"/>
@@ -2648,7 +2648,7 @@
       <w:r>
         <w:t xml:space="preserve"> </w:t>
       </w:r>
-      <w:hyperlink r:id="rId57">
+      <w:hyperlink r:id="rId54">
         <w:r>
           <w:rPr>
             <w:rStyle w:val="Hyperlink"/>
@@ -2660,8 +2660,8 @@
         <w:t xml:space="preserve">.</w:t>
       </w:r>
     </w:p>
-    <w:bookmarkEnd w:id="58"/>
-    <w:bookmarkStart w:id="59" w:name="multilevel-meta-analysis-of-correlations"/>
+    <w:bookmarkEnd w:id="55"/>
+    <w:bookmarkStart w:id="56" w:name="multilevel-meta-analysis-of-correlations"/>
     <w:p>
       <w:pPr>
         <w:pStyle w:val="Heading2"/>
@@ -2829,8 +2829,8 @@
         <w:t xml:space="preserve">These results suggest that, with the exception of Emotional resilience skills, each SEB skill might be considered as a positive correlate of academic achievement, though most effects are small in magnitude. Indeed, only Self-management skills show correlations larger than 0.20 with academic achievement.</w:t>
       </w:r>
     </w:p>
-    <w:bookmarkEnd w:id="59"/>
-    <w:bookmarkStart w:id="62" w:name="Xdd24d222c7553f036fdfd7748ed557d44c190d5"/>
+    <w:bookmarkEnd w:id="56"/>
+    <w:bookmarkStart w:id="59" w:name="Xdd24d222c7553f036fdfd7748ed557d44c190d5"/>
     <w:p>
       <w:pPr>
         <w:pStyle w:val="Heading2"/>
@@ -3006,7 +3006,7 @@
         <w:pStyle w:val="BodyText"/>
       </w:pPr>
       <w:r>
-        <w:t xml:space="preserve">MASEM analyses were based on varying number of effect sizes per pairwise correlation (i.e., different correlation matrices), with the minimum available effects per correlation being 3 and the maximum being 25. As a consequence, also sample sizes and precision differed, with the minimum being 2712 (i.e., correlations between personality traits and academic achievement) and the maximum being 23321 (i.e., correlations between SEB domains). Correlation matrices were taken from 26 samples included in 19 different studies.</w:t>
+        <w:t xml:space="preserve">MASEM analyses were based on varying number of effect sizes per pairwise correlation (i.e., different correlation matrices), with the minimum available effects per correlation being 3 and the maximum being 23. As a consequence, also sample sizes and precision differed, with the minimum being 2712 (i.e., correlations between personality traits and academic achievement) and the maximum being 22592 (i.e., correlations between SEB domains). Correlation matrices were taken from 24 samples included in 17 different studies.</w:t>
       </w:r>
     </w:p>
     <w:p>
@@ -3017,7 +3017,7 @@
         <w:t xml:space="preserve">Given the low number of studies available for some variables, we set between-study variance to zero and estimated a common effect across studies. This approach avoids attempting to estimate random‐effects components that would be unstable or poorly identified in sparse conditions.</w:t>
       </w:r>
     </w:p>
-    <w:bookmarkStart w:id="60" w:name="pooled-correlations"/>
+    <w:bookmarkStart w:id="57" w:name="pooled-correlations"/>
     <w:p>
       <w:pPr>
         <w:pStyle w:val="Heading3"/>
@@ -3058,7 +3058,7 @@
         <w:t xml:space="preserve"> </w:t>
       </w:r>
       <w:r>
-        <w:t xml:space="preserve">&gt; 0.6), with the highest correlation reaching 0.74. For what concerns academic achievement, Self-management (r = 0.24), BF Conscientiousness (r = 0.22) were the only variables among SEB skills and Big Five traits showing a pooled correlation higher than</w:t>
+        <w:t xml:space="preserve">&gt; 0.62), with the highest correlation reaching 0.74. For what concerns academic achievement, Self-management (r = 0.24), BF Conscientiousness (r = 0.22) were the only variables among SEB skills and Big Five traits showing a pooled correlation higher than</w:t>
       </w:r>
       <w:r>
         <w:t xml:space="preserve"> </w:t>
@@ -3077,8 +3077,8 @@
         <w:t xml:space="preserve">&gt; 0.2 with academic achievement.</w:t>
       </w:r>
     </w:p>
-    <w:bookmarkEnd w:id="60"/>
-    <w:bookmarkStart w:id="61" w:name="incremental-validity-beyond-the-big-five"/>
+    <w:bookmarkEnd w:id="57"/>
+    <w:bookmarkStart w:id="58" w:name="incremental-validity-beyond-the-big-five"/>
     <w:p>
       <w:pPr>
         <w:pStyle w:val="Heading3"/>
@@ -3130,9 +3130,9 @@
         <w:t xml:space="preserve">These results confirm that SEB skills, as measured by the BESSI questionnaires, differ from the Big Five in terms of predictive validity, with Innovation, Self-management, and Social engagement having higher predictive power than Openness, Conscientiousness, and Extraversion.</w:t>
       </w:r>
     </w:p>
-    <w:bookmarkEnd w:id="61"/>
-    <w:bookmarkEnd w:id="62"/>
-    <w:bookmarkStart w:id="63" w:name="incremental-validity-between-seb-skills"/>
+    <w:bookmarkEnd w:id="58"/>
+    <w:bookmarkEnd w:id="59"/>
+    <w:bookmarkStart w:id="60" w:name="incremental-validity-between-seb-skills"/>
     <w:p>
       <w:pPr>
         <w:pStyle w:val="Heading2"/>
@@ -3173,7 +3173,7 @@
         <w:t xml:space="preserve"> </w:t>
       </w:r>
       <w:r>
-        <w:t xml:space="preserve">&lt; 0.01) larger than |0.1| with academic achievement beyond the other skill domains. Specifically, Emotional resilience (b = -0.11; 95% CI [-0.13; -0.09]; p &lt; 0.001), Self-management (b = 0.24; 95% CI [0.22; 0.25]; p &lt; 0.001) showed significant and practically meaningful associations with academic achievement, while all other associations were lower than |0.05| and/or non-significant.</w:t>
+        <w:t xml:space="preserve">&lt; 0.01) larger than |0.1| with academic achievement beyond the other skill domains. Specifically, Emotional resilience (b = -0.11; 95% CI [-0.13; -0.09]; p &lt; 0.001), Self-management (b = 0.24; 95% CI [0.22; 0.25]; p &lt; 0.001) showed significant and practically meaningful associations with academic achievement, while all other associations were lower than |0.06| and/or non-significant.</w:t>
       </w:r>
     </w:p>
     <w:p>
@@ -3184,8 +3184,8 @@
         <w:t xml:space="preserve">These results confirm Self-management as the most predictive skill for academic achievement. However, the results also show a small but negative effect of Emotional resilience skills, potentially due to multicollinearity or suppression effects.</w:t>
       </w:r>
     </w:p>
-    <w:bookmarkEnd w:id="63"/>
-    <w:bookmarkStart w:id="64" w:name="reproducibility-via-the-living-seb-app"/>
+    <w:bookmarkEnd w:id="60"/>
+    <w:bookmarkStart w:id="61" w:name="reproducibility-via-the-living-seb-app"/>
     <w:p>
       <w:pPr>
         <w:pStyle w:val="Heading2"/>
@@ -3204,7 +3204,7 @@
       <w:r>
         <w:t xml:space="preserve"> </w:t>
       </w:r>
-      <w:hyperlink r:id="rId57">
+      <w:hyperlink r:id="rId54">
         <w:r>
           <w:rPr>
             <w:rStyle w:val="Hyperlink"/>
@@ -3219,9 +3219,9 @@
         <w:t xml:space="preserve">as part of the project.</w:t>
       </w:r>
     </w:p>
-    <w:bookmarkEnd w:id="64"/>
-    <w:bookmarkEnd w:id="65"/>
-    <w:bookmarkStart w:id="70" w:name="discussion"/>
+    <w:bookmarkEnd w:id="61"/>
+    <w:bookmarkEnd w:id="62"/>
+    <w:bookmarkStart w:id="67" w:name="discussion"/>
     <w:p>
       <w:pPr>
         <w:pStyle w:val="Heading1"/>
@@ -3246,7 +3246,7 @@
         <w:t xml:space="preserve">As exemplified in these analyses, the Living SEB Skills Project provides the necessary tools and data for responding cross-sectional research questions and synthesizing the available evidence using meta-analysis. However, different uses can be made of this data and of the Living SEB App.</w:t>
       </w:r>
     </w:p>
-    <w:bookmarkStart w:id="66" w:name="X7f2835a56e74432eaa242baf8e2936a08c3d351"/>
+    <w:bookmarkStart w:id="63" w:name="X7f2835a56e74432eaa242baf8e2936a08c3d351"/>
     <w:p>
       <w:pPr>
         <w:pStyle w:val="Heading2"/>
@@ -3313,8 +3313,8 @@
         <w:t xml:space="preserve">illustrates how infrastructures of cumulative evidence can shift psychology toward a more dynamic and self-correcting science. Instead of relying on static reviews that quickly become outdated, researchers can build and refine theoretical models with a continually refreshed evidence base. In this sense, the project does not simply provide a database or app but models a new standard for how psychological theory and evidence can co-evolve.</w:t>
       </w:r>
     </w:p>
-    <w:bookmarkEnd w:id="66"/>
-    <w:bookmarkStart w:id="67" w:name="limitations"/>
+    <w:bookmarkEnd w:id="63"/>
+    <w:bookmarkStart w:id="64" w:name="limitations"/>
     <w:p>
       <w:pPr>
         <w:pStyle w:val="Heading2"/>
@@ -3363,8 +3363,8 @@
         <w:t xml:space="preserve">only is not the appropriate choice, but more refined analyses should be conducted locally by the researcher. In particular, only cross-sectional data are available. To analyse experimental and longitudinal data, the necessary data must be manually coded (but all the papers needed should already be included in our database). Additionally, the specific measures used are not coded in the data and different measures are automatically meta-analysed as indicators of a specific outcome or construct. For instance, school engagement could be measured with different questionnaires. Authors interested in moderator analyses should code those specific information. Similarly, study topics are manually and qualitatively defined by the authors and may not correspond to everybody’s opinion. We also acknowledge that our reliance on citation-chaining of seminal SEB works may result in missed eligible publications, particularly those that employ BESSI measures without directly citing the validation articles. While this approach ensures feasibility and reduces noise, it might eventually compromise full systematic comprehensiveness. In the long term, we plan to supplement this strategy with periodic keyword-based searches and, where possible, semi-automated text-mining or machine-learning methods to identify overlooked studies. Meanwhile, we actively encourage researchers to notify us of missing contributions so that the database can remain as inclusive as possible. To date, we are not aware of any published studies within the SEB framework that are excluded.</w:t>
       </w:r>
     </w:p>
-    <w:bookmarkEnd w:id="67"/>
-    <w:bookmarkStart w:id="68" w:name="future-perspectives"/>
+    <w:bookmarkEnd w:id="64"/>
+    <w:bookmarkStart w:id="65" w:name="future-perspectives"/>
     <w:p>
       <w:pPr>
         <w:pStyle w:val="Heading2"/>
@@ -3397,8 +3397,8 @@
         <w:t xml:space="preserve">and app that respect the boundaries of the functionality offered. However, future updates of the project may enlarge the aims of the project and its uses. In particular, with increasing number of longitudinal and experimental publications within the SEB framework, the meta-analysis options of the app could be extended to incorporate both possibilities. We also plan to include options for the analysis of moderators and for publication bias. Depending on future funding and resources, it could be possible to automatize the database search and coding procedures through the use of ad-hoc algorithms and artificial intelligence. Moreover, Users may be provided with the possibility to upload additional data in the main database for personal use or openly for the community. Finally, a future extension of the present work could be to integrate the new specific living resources into broader projects (for example, metaBUS; Bosco et al., 2020) that could benefit from well-organized databases focused on specific topics. However, a common framework for labelling and recognizing the different constructs will be necessary to finally integrate the various efforts.</w:t>
       </w:r>
     </w:p>
-    <w:bookmarkEnd w:id="68"/>
-    <w:bookmarkStart w:id="69" w:name="conclusions"/>
+    <w:bookmarkEnd w:id="65"/>
+    <w:bookmarkStart w:id="66" w:name="conclusions"/>
     <w:p>
       <w:pPr>
         <w:pStyle w:val="Heading2"/>
@@ -3433,9 +3433,9 @@
         <w:br w:type="page"/>
       </w:r>
     </w:p>
-    <w:bookmarkEnd w:id="69"/>
-    <w:bookmarkEnd w:id="70"/>
-    <w:bookmarkStart w:id="196" w:name="references"/>
+    <w:bookmarkEnd w:id="66"/>
+    <w:bookmarkEnd w:id="67"/>
+    <w:bookmarkStart w:id="193" w:name="references"/>
     <w:p>
       <w:pPr>
         <w:pStyle w:val="Heading1"/>
@@ -3444,8 +3444,8 @@
         <w:t xml:space="preserve">References</w:t>
       </w:r>
     </w:p>
-    <w:bookmarkStart w:id="178" w:name="refs"/>
-    <w:bookmarkStart w:id="72" w:name="X2cff003dd1618d8cd6604ca920c5e7b44e311a1"/>
+    <w:bookmarkStart w:id="175" w:name="refs"/>
+    <w:bookmarkStart w:id="69" w:name="X2cff003dd1618d8cd6604ca920c5e7b44e311a1"/>
     <w:p>
       <w:pPr>
         <w:pStyle w:val="Bibliography"/>
@@ -3482,7 +3482,7 @@
       <w:r>
         <w:t xml:space="preserve"> </w:t>
       </w:r>
-      <w:hyperlink r:id="rId71">
+      <w:hyperlink r:id="rId68">
         <w:r>
           <w:rPr>
             <w:rStyle w:val="Hyperlink"/>
@@ -3491,8 +3491,8 @@
         </w:r>
       </w:hyperlink>
     </w:p>
-    <w:bookmarkEnd w:id="72"/>
-    <w:bookmarkStart w:id="74" w:name="Xf78a0d256d2214793ab03b9839ec64a2761d1c6"/>
+    <w:bookmarkEnd w:id="69"/>
+    <w:bookmarkStart w:id="71" w:name="Xf78a0d256d2214793ab03b9839ec64a2761d1c6"/>
     <w:p>
       <w:pPr>
         <w:pStyle w:val="Bibliography"/>
@@ -3529,7 +3529,7 @@
       <w:r>
         <w:t xml:space="preserve"> </w:t>
       </w:r>
-      <w:hyperlink r:id="rId73">
+      <w:hyperlink r:id="rId70">
         <w:r>
           <w:rPr>
             <w:rStyle w:val="Hyperlink"/>
@@ -3538,8 +3538,8 @@
         </w:r>
       </w:hyperlink>
     </w:p>
-    <w:bookmarkEnd w:id="74"/>
-    <w:bookmarkStart w:id="75" w:name="ref-borenstein2021"/>
+    <w:bookmarkEnd w:id="71"/>
+    <w:bookmarkStart w:id="72" w:name="ref-borenstein2021"/>
     <w:p>
       <w:pPr>
         <w:pStyle w:val="Bibliography"/>
@@ -3561,8 +3561,8 @@
         <w:t xml:space="preserve">. John Wiley &amp; Sons.</w:t>
       </w:r>
     </w:p>
-    <w:bookmarkEnd w:id="75"/>
-    <w:bookmarkStart w:id="77" w:name="X1a16d6e0f9131f0c0a7b184e89b95dd7a53f963"/>
+    <w:bookmarkEnd w:id="72"/>
+    <w:bookmarkStart w:id="74" w:name="X1a16d6e0f9131f0c0a7b184e89b95dd7a53f963"/>
     <w:p>
       <w:pPr>
         <w:pStyle w:val="Bibliography"/>
@@ -3599,7 +3599,7 @@
       <w:r>
         <w:t xml:space="preserve"> </w:t>
       </w:r>
-      <w:hyperlink r:id="rId76">
+      <w:hyperlink r:id="rId73">
         <w:r>
           <w:rPr>
             <w:rStyle w:val="Hyperlink"/>
@@ -3608,8 +3608,8 @@
         </w:r>
       </w:hyperlink>
     </w:p>
-    <w:bookmarkEnd w:id="77"/>
-    <w:bookmarkStart w:id="79" w:name="X408390b1eb78f22baf55e3ecf40718f1643c74b"/>
+    <w:bookmarkEnd w:id="74"/>
+    <w:bookmarkStart w:id="76" w:name="X408390b1eb78f22baf55e3ecf40718f1643c74b"/>
     <w:p>
       <w:pPr>
         <w:pStyle w:val="Bibliography"/>
@@ -3643,7 +3643,7 @@
       <w:r>
         <w:t xml:space="preserve">(1). https://doi.org/</w:t>
       </w:r>
-      <w:hyperlink r:id="rId78">
+      <w:hyperlink r:id="rId75">
         <w:r>
           <w:rPr>
             <w:rStyle w:val="Hyperlink"/>
@@ -3652,8 +3652,8 @@
         </w:r>
       </w:hyperlink>
     </w:p>
-    <w:bookmarkEnd w:id="79"/>
-    <w:bookmarkStart w:id="81" w:name="ref-breil2022"/>
+    <w:bookmarkEnd w:id="76"/>
+    <w:bookmarkStart w:id="78" w:name="ref-breil2022"/>
     <w:p>
       <w:pPr>
         <w:pStyle w:val="Bibliography"/>
@@ -3690,7 +3690,7 @@
       <w:r>
         <w:t xml:space="preserve"> </w:t>
       </w:r>
-      <w:hyperlink r:id="rId80">
+      <w:hyperlink r:id="rId77">
         <w:r>
           <w:rPr>
             <w:rStyle w:val="Hyperlink"/>
@@ -3699,8 +3699,8 @@
         </w:r>
       </w:hyperlink>
     </w:p>
-    <w:bookmarkEnd w:id="81"/>
-    <w:bookmarkStart w:id="83" w:name="ref-chenSocialEmotionalBehavioral2024"/>
+    <w:bookmarkEnd w:id="78"/>
+    <w:bookmarkStart w:id="80" w:name="ref-chenSocialEmotionalBehavioral2024"/>
     <w:p>
       <w:pPr>
         <w:pStyle w:val="Bibliography"/>
@@ -3737,7 +3737,7 @@
       <w:r>
         <w:t xml:space="preserve"> </w:t>
       </w:r>
-      <w:hyperlink r:id="rId82">
+      <w:hyperlink r:id="rId79">
         <w:r>
           <w:rPr>
             <w:rStyle w:val="Hyperlink"/>
@@ -3746,8 +3746,8 @@
         </w:r>
       </w:hyperlink>
     </w:p>
-    <w:bookmarkEnd w:id="83"/>
-    <w:bookmarkStart w:id="84" w:name="X2adb9ed5c439b822c73e02a95f751bf4d740d54"/>
+    <w:bookmarkEnd w:id="80"/>
+    <w:bookmarkStart w:id="81" w:name="X2adb9ed5c439b822c73e02a95f751bf4d740d54"/>
     <w:p>
       <w:pPr>
         <w:pStyle w:val="Bibliography"/>
@@ -3769,8 +3769,8 @@
         <w:t xml:space="preserve">. John Wiley &amp; Sons.</w:t>
       </w:r>
     </w:p>
-    <w:bookmarkEnd w:id="84"/>
-    <w:bookmarkStart w:id="86" w:name="ref-cheung2024MetaSEMMetaAnalysisUsing"/>
+    <w:bookmarkEnd w:id="81"/>
+    <w:bookmarkStart w:id="83" w:name="ref-cheung2024MetaSEMMetaAnalysisUsing"/>
     <w:p>
       <w:pPr>
         <w:pStyle w:val="Bibliography"/>
@@ -3794,7 +3794,7 @@
       <w:r>
         <w:t xml:space="preserve"> </w:t>
       </w:r>
-      <w:hyperlink r:id="rId85">
+      <w:hyperlink r:id="rId82">
         <w:r>
           <w:rPr>
             <w:rStyle w:val="Hyperlink"/>
@@ -3803,8 +3803,8 @@
         </w:r>
       </w:hyperlink>
     </w:p>
-    <w:bookmarkEnd w:id="86"/>
-    <w:bookmarkStart w:id="88" w:name="ref-collie2025"/>
+    <w:bookmarkEnd w:id="83"/>
+    <w:bookmarkStart w:id="85" w:name="ref-collie2025"/>
     <w:p>
       <w:pPr>
         <w:pStyle w:val="Bibliography"/>
@@ -3850,7 +3850,7 @@
       <w:r>
         <w:t xml:space="preserve"> </w:t>
       </w:r>
-      <w:hyperlink r:id="rId87">
+      <w:hyperlink r:id="rId84">
         <w:r>
           <w:rPr>
             <w:rStyle w:val="Hyperlink"/>
@@ -3859,8 +3859,8 @@
         </w:r>
       </w:hyperlink>
     </w:p>
-    <w:bookmarkEnd w:id="88"/>
-    <w:bookmarkStart w:id="90" w:name="ref-cuijpersLivingSystematicReviews2022"/>
+    <w:bookmarkEnd w:id="85"/>
+    <w:bookmarkStart w:id="87" w:name="ref-cuijpersLivingSystematicReviews2022"/>
     <w:p>
       <w:pPr>
         <w:pStyle w:val="Bibliography"/>
@@ -3897,7 +3897,7 @@
       <w:r>
         <w:t xml:space="preserve"> </w:t>
       </w:r>
-      <w:hyperlink r:id="rId89">
+      <w:hyperlink r:id="rId86">
         <w:r>
           <w:rPr>
             <w:rStyle w:val="Hyperlink"/>
@@ -3906,8 +3906,8 @@
         </w:r>
       </w:hyperlink>
     </w:p>
-    <w:bookmarkEnd w:id="90"/>
-    <w:bookmarkStart w:id="92" w:name="Xf7b72a721a2d264725390a9c15185df6ed1f0f7"/>
+    <w:bookmarkEnd w:id="87"/>
+    <w:bookmarkStart w:id="89" w:name="Xf7b72a721a2d264725390a9c15185df6ed1f0f7"/>
     <w:p>
       <w:pPr>
         <w:pStyle w:val="Bibliography"/>
@@ -3931,7 +3931,7 @@
       <w:r>
         <w:t xml:space="preserve"> </w:t>
       </w:r>
-      <w:hyperlink r:id="rId91">
+      <w:hyperlink r:id="rId88">
         <w:r>
           <w:rPr>
             <w:rStyle w:val="Hyperlink"/>
@@ -3940,8 +3940,8 @@
         </w:r>
       </w:hyperlink>
     </w:p>
-    <w:bookmarkEnd w:id="92"/>
-    <w:bookmarkStart w:id="94" w:name="ref-elliottLivingSystematicReview2017"/>
+    <w:bookmarkEnd w:id="89"/>
+    <w:bookmarkStart w:id="91" w:name="ref-elliottLivingSystematicReview2017"/>
     <w:p>
       <w:pPr>
         <w:pStyle w:val="Bibliography"/>
@@ -3981,7 +3981,7 @@
       <w:r>
         <w:t xml:space="preserve"> </w:t>
       </w:r>
-      <w:hyperlink r:id="rId93">
+      <w:hyperlink r:id="rId90">
         <w:r>
           <w:rPr>
             <w:rStyle w:val="Hyperlink"/>
@@ -3990,8 +3990,8 @@
         </w:r>
       </w:hyperlink>
     </w:p>
-    <w:bookmarkEnd w:id="94"/>
-    <w:bookmarkStart w:id="96" w:name="ref-elliottLivingSystematicReviews2014"/>
+    <w:bookmarkEnd w:id="91"/>
+    <w:bookmarkStart w:id="93" w:name="ref-elliottLivingSystematicReviews2014"/>
     <w:p>
       <w:pPr>
         <w:pStyle w:val="Bibliography"/>
@@ -4028,7 +4028,7 @@
       <w:r>
         <w:t xml:space="preserve"> </w:t>
       </w:r>
-      <w:hyperlink r:id="rId95">
+      <w:hyperlink r:id="rId92">
         <w:r>
           <w:rPr>
             <w:rStyle w:val="Hyperlink"/>
@@ -4037,8 +4037,8 @@
         </w:r>
       </w:hyperlink>
     </w:p>
-    <w:bookmarkEnd w:id="96"/>
-    <w:bookmarkStart w:id="98" w:name="ref-feracoSoftSkillsHigh2025"/>
+    <w:bookmarkEnd w:id="93"/>
+    <w:bookmarkStart w:id="95" w:name="ref-feracoSoftSkillsHigh2025"/>
     <w:p>
       <w:pPr>
         <w:pStyle w:val="Bibliography"/>
@@ -4075,7 +4075,7 @@
       <w:r>
         <w:t xml:space="preserve"> </w:t>
       </w:r>
-      <w:hyperlink r:id="rId97">
+      <w:hyperlink r:id="rId94">
         <w:r>
           <w:rPr>
             <w:rStyle w:val="Hyperlink"/>
@@ -4084,8 +4084,8 @@
         </w:r>
       </w:hyperlink>
     </w:p>
-    <w:bookmarkEnd w:id="98"/>
-    <w:bookmarkStart w:id="100" w:name="ref-feracoRoleSocialEmotional2025"/>
+    <w:bookmarkEnd w:id="95"/>
+    <w:bookmarkStart w:id="97" w:name="ref-feracoRoleSocialEmotional2025"/>
     <w:p>
       <w:pPr>
         <w:pStyle w:val="Bibliography"/>
@@ -4109,7 +4109,7 @@
       <w:r>
         <w:t xml:space="preserve"> </w:t>
       </w:r>
-      <w:hyperlink r:id="rId99">
+      <w:hyperlink r:id="rId96">
         <w:r>
           <w:rPr>
             <w:rStyle w:val="Hyperlink"/>
@@ -4118,8 +4118,8 @@
         </w:r>
       </w:hyperlink>
     </w:p>
-    <w:bookmarkEnd w:id="100"/>
-    <w:bookmarkStart w:id="102" w:name="ref-feracoItalianBehavioralEmotional2024"/>
+    <w:bookmarkEnd w:id="97"/>
+    <w:bookmarkStart w:id="99" w:name="ref-feracoItalianBehavioralEmotional2024"/>
     <w:p>
       <w:pPr>
         <w:pStyle w:val="Bibliography"/>
@@ -4156,7 +4156,7 @@
       <w:r>
         <w:t xml:space="preserve"> </w:t>
       </w:r>
-      <w:hyperlink r:id="rId101">
+      <w:hyperlink r:id="rId98">
         <w:r>
           <w:rPr>
             <w:rStyle w:val="Hyperlink"/>
@@ -4165,8 +4165,8 @@
         </w:r>
       </w:hyperlink>
     </w:p>
-    <w:bookmarkEnd w:id="102"/>
-    <w:bookmarkStart w:id="104" w:name="ref-feracoDifferencesChangeGoals2025"/>
+    <w:bookmarkEnd w:id="99"/>
+    <w:bookmarkStart w:id="101" w:name="ref-feracoDifferencesChangeGoals2025"/>
     <w:p>
       <w:pPr>
         <w:pStyle w:val="Bibliography"/>
@@ -4203,7 +4203,7 @@
       <w:r>
         <w:t xml:space="preserve"> </w:t>
       </w:r>
-      <w:hyperlink r:id="rId103">
+      <w:hyperlink r:id="rId100">
         <w:r>
           <w:rPr>
             <w:rStyle w:val="Hyperlink"/>
@@ -4212,8 +4212,8 @@
         </w:r>
       </w:hyperlink>
     </w:p>
-    <w:bookmarkEnd w:id="104"/>
-    <w:bookmarkStart w:id="106" w:name="ref-feracoSocialEmotionalBehavioral2023"/>
+    <w:bookmarkEnd w:id="101"/>
+    <w:bookmarkStart w:id="103" w:name="ref-feracoSocialEmotionalBehavioral2023"/>
     <w:p>
       <w:pPr>
         <w:pStyle w:val="Bibliography"/>
@@ -4250,7 +4250,7 @@
       <w:r>
         <w:t xml:space="preserve"> </w:t>
       </w:r>
-      <w:hyperlink r:id="rId105">
+      <w:hyperlink r:id="rId102">
         <w:r>
           <w:rPr>
             <w:rStyle w:val="Hyperlink"/>
@@ -4259,8 +4259,8 @@
         </w:r>
       </w:hyperlink>
     </w:p>
-    <w:bookmarkEnd w:id="106"/>
-    <w:bookmarkStart w:id="108" w:name="ref-feracoSocialEmotionalBehavioral2025"/>
+    <w:bookmarkEnd w:id="103"/>
+    <w:bookmarkStart w:id="105" w:name="ref-feracoSocialEmotionalBehavioral2025"/>
     <w:p>
       <w:pPr>
         <w:pStyle w:val="Bibliography"/>
@@ -4297,7 +4297,7 @@
       <w:r>
         <w:t xml:space="preserve"> </w:t>
       </w:r>
-      <w:hyperlink r:id="rId107">
+      <w:hyperlink r:id="rId104">
         <w:r>
           <w:rPr>
             <w:rStyle w:val="Hyperlink"/>
@@ -4306,8 +4306,8 @@
         </w:r>
       </w:hyperlink>
     </w:p>
-    <w:bookmarkEnd w:id="108"/>
-    <w:bookmarkStart w:id="110" w:name="ref-feracoIntegratedModelSchool2023"/>
+    <w:bookmarkEnd w:id="105"/>
+    <w:bookmarkStart w:id="107" w:name="ref-feracoIntegratedModelSchool2023"/>
     <w:p>
       <w:pPr>
         <w:pStyle w:val="Bibliography"/>
@@ -4353,7 +4353,7 @@
       <w:r>
         <w:t xml:space="preserve"> </w:t>
       </w:r>
-      <w:hyperlink r:id="rId109">
+      <w:hyperlink r:id="rId106">
         <w:r>
           <w:rPr>
             <w:rStyle w:val="Hyperlink"/>
@@ -4362,8 +4362,8 @@
         </w:r>
       </w:hyperlink>
     </w:p>
-    <w:bookmarkEnd w:id="110"/>
-    <w:bookmarkStart w:id="112" w:name="ref-guoRolesSocialEmotional2023"/>
+    <w:bookmarkEnd w:id="107"/>
+    <w:bookmarkStart w:id="109" w:name="ref-guoRolesSocialEmotional2023"/>
     <w:p>
       <w:pPr>
         <w:pStyle w:val="Bibliography"/>
@@ -4412,7 +4412,7 @@
       <w:r>
         <w:t xml:space="preserve"> </w:t>
       </w:r>
-      <w:hyperlink r:id="rId111">
+      <w:hyperlink r:id="rId108">
         <w:r>
           <w:rPr>
             <w:rStyle w:val="Hyperlink"/>
@@ -4421,8 +4421,8 @@
         </w:r>
       </w:hyperlink>
     </w:p>
-    <w:bookmarkEnd w:id="112"/>
-    <w:bookmarkStart w:id="114" w:name="ref-heckman2012"/>
+    <w:bookmarkEnd w:id="109"/>
+    <w:bookmarkStart w:id="111" w:name="ref-heckman2012"/>
     <w:p>
       <w:pPr>
         <w:pStyle w:val="Bibliography"/>
@@ -4459,7 +4459,7 @@
       <w:r>
         <w:t xml:space="preserve"> </w:t>
       </w:r>
-      <w:hyperlink r:id="rId113">
+      <w:hyperlink r:id="rId110">
         <w:r>
           <w:rPr>
             <w:rStyle w:val="Hyperlink"/>
@@ -4468,8 +4468,8 @@
         </w:r>
       </w:hyperlink>
     </w:p>
-    <w:bookmarkEnd w:id="114"/>
-    <w:bookmarkStart w:id="116" w:name="ref-hirtCitationTrackingSystematic2023"/>
+    <w:bookmarkEnd w:id="111"/>
+    <w:bookmarkStart w:id="113" w:name="ref-hirtCitationTrackingSystematic2023"/>
     <w:p>
       <w:pPr>
         <w:pStyle w:val="Bibliography"/>
@@ -4506,7 +4506,7 @@
       <w:r>
         <w:t xml:space="preserve"> </w:t>
       </w:r>
-      <w:hyperlink r:id="rId115">
+      <w:hyperlink r:id="rId112">
         <w:r>
           <w:rPr>
             <w:rStyle w:val="Hyperlink"/>
@@ -4515,8 +4515,8 @@
         </w:r>
       </w:hyperlink>
     </w:p>
-    <w:bookmarkEnd w:id="116"/>
-    <w:bookmarkStart w:id="118" w:name="ref-howardWhyWeNeed2025"/>
+    <w:bookmarkEnd w:id="113"/>
+    <w:bookmarkStart w:id="115" w:name="ref-howardWhyWeNeed2025"/>
     <w:p>
       <w:pPr>
         <w:pStyle w:val="Bibliography"/>
@@ -4540,7 +4540,7 @@
       <w:r>
         <w:t xml:space="preserve"> </w:t>
       </w:r>
-      <w:hyperlink r:id="rId117">
+      <w:hyperlink r:id="rId114">
         <w:r>
           <w:rPr>
             <w:rStyle w:val="Hyperlink"/>
@@ -4549,8 +4549,8 @@
         </w:r>
       </w:hyperlink>
     </w:p>
-    <w:bookmarkEnd w:id="118"/>
-    <w:bookmarkStart w:id="120" w:name="ref-ichsanVirtualRealitySkill2025"/>
+    <w:bookmarkEnd w:id="115"/>
+    <w:bookmarkStart w:id="117" w:name="ref-ichsanVirtualRealitySkill2025"/>
     <w:p>
       <w:pPr>
         <w:pStyle w:val="Bibliography"/>
@@ -4587,7 +4587,7 @@
       <w:r>
         <w:t xml:space="preserve"> </w:t>
       </w:r>
-      <w:hyperlink r:id="rId119">
+      <w:hyperlink r:id="rId116">
         <w:r>
           <w:rPr>
             <w:rStyle w:val="Hyperlink"/>
@@ -4596,8 +4596,8 @@
         </w:r>
       </w:hyperlink>
     </w:p>
-    <w:bookmarkEnd w:id="120"/>
-    <w:bookmarkStart w:id="122" w:name="X97b51aaae8911da2956c6ff2e3d234435f67bf7"/>
+    <w:bookmarkEnd w:id="117"/>
+    <w:bookmarkStart w:id="119" w:name="X97b51aaae8911da2956c6ff2e3d234435f67bf7"/>
     <w:p>
       <w:pPr>
         <w:pStyle w:val="Bibliography"/>
@@ -4634,7 +4634,7 @@
       <w:r>
         <w:t xml:space="preserve"> </w:t>
       </w:r>
-      <w:hyperlink r:id="rId121">
+      <w:hyperlink r:id="rId118">
         <w:r>
           <w:rPr>
             <w:rStyle w:val="Hyperlink"/>
@@ -4643,8 +4643,8 @@
         </w:r>
       </w:hyperlink>
     </w:p>
-    <w:bookmarkEnd w:id="122"/>
-    <w:bookmarkStart w:id="124" w:name="X95a48c3bd0fb12e6c8d27e000e5abe5f775fd14"/>
+    <w:bookmarkEnd w:id="119"/>
+    <w:bookmarkStart w:id="121" w:name="X95a48c3bd0fb12e6c8d27e000e5abe5f775fd14"/>
     <w:p>
       <w:pPr>
         <w:pStyle w:val="Bibliography"/>
@@ -4681,7 +4681,7 @@
       <w:r>
         <w:t xml:space="preserve"> </w:t>
       </w:r>
-      <w:hyperlink r:id="rId123">
+      <w:hyperlink r:id="rId120">
         <w:r>
           <w:rPr>
             <w:rStyle w:val="Hyperlink"/>
@@ -4690,8 +4690,8 @@
         </w:r>
       </w:hyperlink>
     </w:p>
-    <w:bookmarkEnd w:id="124"/>
-    <w:bookmarkStart w:id="126" w:name="ref-lechnerBehavioralEmotionalSocial2022"/>
+    <w:bookmarkEnd w:id="121"/>
+    <w:bookmarkStart w:id="123" w:name="ref-lechnerBehavioralEmotionalSocial2022"/>
     <w:p>
       <w:pPr>
         <w:pStyle w:val="Bibliography"/>
@@ -4728,7 +4728,7 @@
       <w:r>
         <w:t xml:space="preserve"> </w:t>
       </w:r>
-      <w:hyperlink r:id="rId125">
+      <w:hyperlink r:id="rId122">
         <w:r>
           <w:rPr>
             <w:rStyle w:val="Hyperlink"/>
@@ -4737,8 +4737,8 @@
         </w:r>
       </w:hyperlink>
     </w:p>
-    <w:bookmarkEnd w:id="126"/>
-    <w:bookmarkStart w:id="128" w:name="X036b1a09cb564fd5fec0952e53199c1d462fd56"/>
+    <w:bookmarkEnd w:id="123"/>
+    <w:bookmarkStart w:id="125" w:name="X036b1a09cb564fd5fec0952e53199c1d462fd56"/>
     <w:p>
       <w:pPr>
         <w:pStyle w:val="Bibliography"/>
@@ -4775,7 +4775,7 @@
       <w:r>
         <w:t xml:space="preserve"> </w:t>
       </w:r>
-      <w:hyperlink r:id="rId127">
+      <w:hyperlink r:id="rId124">
         <w:r>
           <w:rPr>
             <w:rStyle w:val="Hyperlink"/>
@@ -4784,8 +4784,8 @@
         </w:r>
       </w:hyperlink>
     </w:p>
-    <w:bookmarkEnd w:id="128"/>
-    <w:bookmarkStart w:id="130" w:name="ref-mccrae1989"/>
+    <w:bookmarkEnd w:id="125"/>
+    <w:bookmarkStart w:id="127" w:name="ref-mccrae1989"/>
     <w:p>
       <w:pPr>
         <w:pStyle w:val="Bibliography"/>
@@ -4822,7 +4822,7 @@
       <w:r>
         <w:t xml:space="preserve"> </w:t>
       </w:r>
-      <w:hyperlink r:id="rId129">
+      <w:hyperlink r:id="rId126">
         <w:r>
           <w:rPr>
             <w:rStyle w:val="Hyperlink"/>
@@ -4831,8 +4831,8 @@
         </w:r>
       </w:hyperlink>
     </w:p>
-    <w:bookmarkEnd w:id="130"/>
-    <w:bookmarkStart w:id="132" w:name="ref-moherPreferredReportingItems2015"/>
+    <w:bookmarkEnd w:id="127"/>
+    <w:bookmarkStart w:id="129" w:name="ref-moherPreferredReportingItems2015"/>
     <w:p>
       <w:pPr>
         <w:pStyle w:val="Bibliography"/>
@@ -4869,7 +4869,7 @@
       <w:r>
         <w:t xml:space="preserve"> </w:t>
       </w:r>
-      <w:hyperlink r:id="rId131">
+      <w:hyperlink r:id="rId128">
         <w:r>
           <w:rPr>
             <w:rStyle w:val="Hyperlink"/>
@@ -4878,8 +4878,8 @@
         </w:r>
       </w:hyperlink>
     </w:p>
-    <w:bookmarkEnd w:id="132"/>
-    <w:bookmarkStart w:id="134" w:name="Xe1475e88fa5f75c16c1338eefb377bb33d14b69"/>
+    <w:bookmarkEnd w:id="129"/>
+    <w:bookmarkStart w:id="131" w:name="Xe1475e88fa5f75c16c1338eefb377bb33d14b69"/>
     <w:p>
       <w:pPr>
         <w:pStyle w:val="Bibliography"/>
@@ -4916,7 +4916,7 @@
       <w:r>
         <w:t xml:space="preserve"> </w:t>
       </w:r>
-      <w:hyperlink r:id="rId133">
+      <w:hyperlink r:id="rId130">
         <w:r>
           <w:rPr>
             <w:rStyle w:val="Hyperlink"/>
@@ -4925,8 +4925,8 @@
         </w:r>
       </w:hyperlink>
     </w:p>
-    <w:bookmarkEnd w:id="134"/>
-    <w:bookmarkStart w:id="136" w:name="ref-napolitanoChangesSocialEmotional2025"/>
+    <w:bookmarkEnd w:id="131"/>
+    <w:bookmarkStart w:id="133" w:name="ref-napolitanoChangesSocialEmotional2025"/>
     <w:p>
       <w:pPr>
         <w:pStyle w:val="Bibliography"/>
@@ -4959,7 +4959,7 @@
       <w:r>
         <w:t xml:space="preserve"> </w:t>
       </w:r>
-      <w:hyperlink r:id="rId135">
+      <w:hyperlink r:id="rId132">
         <w:r>
           <w:rPr>
             <w:rStyle w:val="Hyperlink"/>
@@ -4968,8 +4968,8 @@
         </w:r>
       </w:hyperlink>
     </w:p>
-    <w:bookmarkEnd w:id="136"/>
-    <w:bookmarkStart w:id="138" w:name="ref-oecdAcademicLearningFirst2021"/>
+    <w:bookmarkEnd w:id="133"/>
+    <w:bookmarkStart w:id="135" w:name="ref-oecdAcademicLearningFirst2021"/>
     <w:p>
       <w:pPr>
         <w:pStyle w:val="Bibliography"/>
@@ -4993,7 +4993,7 @@
       <w:r>
         <w:t xml:space="preserve"> </w:t>
       </w:r>
-      <w:hyperlink r:id="rId137">
+      <w:hyperlink r:id="rId134">
         <w:r>
           <w:rPr>
             <w:rStyle w:val="Hyperlink"/>
@@ -5002,8 +5002,8 @@
         </w:r>
       </w:hyperlink>
     </w:p>
-    <w:bookmarkEnd w:id="138"/>
-    <w:bookmarkStart w:id="140" w:name="ref-paytonSocialEmotionalLearning2000"/>
+    <w:bookmarkEnd w:id="135"/>
+    <w:bookmarkStart w:id="137" w:name="ref-paytonSocialEmotionalLearning2000"/>
     <w:p>
       <w:pPr>
         <w:pStyle w:val="Bibliography"/>
@@ -5040,7 +5040,7 @@
       <w:r>
         <w:t xml:space="preserve"> </w:t>
       </w:r>
-      <w:hyperlink r:id="rId139">
+      <w:hyperlink r:id="rId136">
         <w:r>
           <w:rPr>
             <w:rStyle w:val="Hyperlink"/>
@@ -5049,8 +5049,8 @@
         </w:r>
       </w:hyperlink>
     </w:p>
-    <w:bookmarkEnd w:id="140"/>
-    <w:bookmarkStart w:id="142" w:name="Xa9e0562277ebc2e30070cd37a2b9b7a899100bd"/>
+    <w:bookmarkEnd w:id="137"/>
+    <w:bookmarkStart w:id="139" w:name="Xa9e0562277ebc2e30070cd37a2b9b7a899100bd"/>
     <w:p>
       <w:pPr>
         <w:pStyle w:val="Bibliography"/>
@@ -5128,7 +5128,7 @@
       <w:r>
         <w:t xml:space="preserve"> </w:t>
       </w:r>
-      <w:hyperlink r:id="rId141">
+      <w:hyperlink r:id="rId138">
         <w:r>
           <w:rPr>
             <w:rStyle w:val="Hyperlink"/>
@@ -5137,8 +5137,8 @@
         </w:r>
       </w:hyperlink>
     </w:p>
-    <w:bookmarkEnd w:id="142"/>
-    <w:bookmarkStart w:id="144" w:name="ref-pellegrinoReadyWhatsNext2025"/>
+    <w:bookmarkEnd w:id="139"/>
+    <w:bookmarkStart w:id="141" w:name="ref-pellegrinoReadyWhatsNext2025"/>
     <w:p>
       <w:pPr>
         <w:pStyle w:val="Bibliography"/>
@@ -5162,7 +5162,7 @@
       <w:r>
         <w:t xml:space="preserve"> </w:t>
       </w:r>
-      <w:hyperlink r:id="rId143">
+      <w:hyperlink r:id="rId140">
         <w:r>
           <w:rPr>
             <w:rStyle w:val="Hyperlink"/>
@@ -5171,8 +5171,8 @@
         </w:r>
       </w:hyperlink>
     </w:p>
-    <w:bookmarkEnd w:id="144"/>
-    <w:bookmarkStart w:id="146" w:name="ref-postigoBehavioralEmotionalSocial2024"/>
+    <w:bookmarkEnd w:id="141"/>
+    <w:bookmarkStart w:id="143" w:name="ref-postigoBehavioralEmotionalSocial2024"/>
     <w:p>
       <w:pPr>
         <w:pStyle w:val="Bibliography"/>
@@ -5196,7 +5196,7 @@
       <w:r>
         <w:t xml:space="preserve"> </w:t>
       </w:r>
-      <w:hyperlink r:id="rId145">
+      <w:hyperlink r:id="rId142">
         <w:r>
           <w:rPr>
             <w:rStyle w:val="Hyperlink"/>
@@ -5205,8 +5205,8 @@
         </w:r>
       </w:hyperlink>
     </w:p>
-    <w:bookmarkEnd w:id="146"/>
-    <w:bookmarkStart w:id="148" w:name="ref-ringwaldMoreSkillTrait2025"/>
+    <w:bookmarkEnd w:id="143"/>
+    <w:bookmarkStart w:id="145" w:name="ref-ringwaldMoreSkillTrait2025"/>
     <w:p>
       <w:pPr>
         <w:pStyle w:val="Bibliography"/>
@@ -5230,7 +5230,7 @@
       <w:r>
         <w:t xml:space="preserve"> </w:t>
       </w:r>
-      <w:hyperlink r:id="rId147">
+      <w:hyperlink r:id="rId144">
         <w:r>
           <w:rPr>
             <w:rStyle w:val="Hyperlink"/>
@@ -5239,8 +5239,8 @@
         </w:r>
       </w:hyperlink>
     </w:p>
-    <w:bookmarkEnd w:id="148"/>
-    <w:bookmarkStart w:id="149" w:name="ref-rosseel2012LavaanPackageStructural"/>
+    <w:bookmarkEnd w:id="145"/>
+    <w:bookmarkStart w:id="146" w:name="ref-rosseel2012LavaanPackageStructural"/>
     <w:p>
       <w:pPr>
         <w:pStyle w:val="Bibliography"/>
@@ -5262,8 +5262,8 @@
         <w:t xml:space="preserve">. 37.</w:t>
       </w:r>
     </w:p>
-    <w:bookmarkEnd w:id="149"/>
-    <w:bookmarkStart w:id="151" w:name="ref-sakalukReconsideringWhatMakes2023"/>
+    <w:bookmarkEnd w:id="146"/>
+    <w:bookmarkStart w:id="148" w:name="ref-sakalukReconsideringWhatMakes2023"/>
     <w:p>
       <w:pPr>
         <w:pStyle w:val="Bibliography"/>
@@ -5300,7 +5300,7 @@
       <w:r>
         <w:t xml:space="preserve"> </w:t>
       </w:r>
-      <w:hyperlink r:id="rId150">
+      <w:hyperlink r:id="rId147">
         <w:r>
           <w:rPr>
             <w:rStyle w:val="Hyperlink"/>
@@ -5309,8 +5309,8 @@
         </w:r>
       </w:hyperlink>
     </w:p>
-    <w:bookmarkEnd w:id="151"/>
-    <w:bookmarkStart w:id="153" w:name="ref-sewellSocialEmotionalBehavioral2023"/>
+    <w:bookmarkEnd w:id="148"/>
+    <w:bookmarkStart w:id="150" w:name="ref-sewellSocialEmotionalBehavioral2023"/>
     <w:p>
       <w:pPr>
         <w:pStyle w:val="Bibliography"/>
@@ -5347,7 +5347,7 @@
       <w:r>
         <w:t xml:space="preserve"> </w:t>
       </w:r>
-      <w:hyperlink r:id="rId152">
+      <w:hyperlink r:id="rId149">
         <w:r>
           <w:rPr>
             <w:rStyle w:val="Hyperlink"/>
@@ -5356,8 +5356,8 @@
         </w:r>
       </w:hyperlink>
     </w:p>
-    <w:bookmarkEnd w:id="153"/>
-    <w:bookmarkStart w:id="155" w:name="ref-sewell2026"/>
+    <w:bookmarkEnd w:id="150"/>
+    <w:bookmarkStart w:id="152" w:name="ref-sewell2026"/>
     <w:p>
       <w:pPr>
         <w:pStyle w:val="Bibliography"/>
@@ -5403,7 +5403,7 @@
       <w:r>
         <w:t xml:space="preserve"> </w:t>
       </w:r>
-      <w:hyperlink r:id="rId154">
+      <w:hyperlink r:id="rId151">
         <w:r>
           <w:rPr>
             <w:rStyle w:val="Hyperlink"/>
@@ -5412,8 +5412,8 @@
         </w:r>
       </w:hyperlink>
     </w:p>
-    <w:bookmarkEnd w:id="155"/>
-    <w:bookmarkStart w:id="157" w:name="ref-sewellAssessingSocialEmotional2024a"/>
+    <w:bookmarkEnd w:id="152"/>
+    <w:bookmarkStart w:id="154" w:name="ref-sewellAssessingSocialEmotional2024a"/>
     <w:p>
       <w:pPr>
         <w:pStyle w:val="Bibliography"/>
@@ -5437,7 +5437,7 @@
       <w:r>
         <w:t xml:space="preserve"> </w:t>
       </w:r>
-      <w:hyperlink r:id="rId156">
+      <w:hyperlink r:id="rId153">
         <w:r>
           <w:rPr>
             <w:rStyle w:val="Hyperlink"/>
@@ -5446,8 +5446,8 @@
         </w:r>
       </w:hyperlink>
     </w:p>
-    <w:bookmarkEnd w:id="157"/>
-    <w:bookmarkStart w:id="159" w:name="X0cb0ee654e2f08ff6eedf58782dc9c5583569f9"/>
+    <w:bookmarkEnd w:id="154"/>
+    <w:bookmarkStart w:id="156" w:name="X0cb0ee654e2f08ff6eedf58782dc9c5583569f9"/>
     <w:p>
       <w:pPr>
         <w:pStyle w:val="Bibliography"/>
@@ -5493,7 +5493,7 @@
       <w:r>
         <w:t xml:space="preserve"> </w:t>
       </w:r>
-      <w:hyperlink r:id="rId158">
+      <w:hyperlink r:id="rId155">
         <w:r>
           <w:rPr>
             <w:rStyle w:val="Hyperlink"/>
@@ -5502,8 +5502,8 @@
         </w:r>
       </w:hyperlink>
     </w:p>
-    <w:bookmarkEnd w:id="159"/>
-    <w:bookmarkStart w:id="161" w:name="ref-sotoTakingSkillsSeriously2021"/>
+    <w:bookmarkEnd w:id="156"/>
+    <w:bookmarkStart w:id="158" w:name="ref-sotoTakingSkillsSeriously2021"/>
     <w:p>
       <w:pPr>
         <w:pStyle w:val="Bibliography"/>
@@ -5540,7 +5540,7 @@
       <w:r>
         <w:t xml:space="preserve"> </w:t>
       </w:r>
-      <w:hyperlink r:id="rId160">
+      <w:hyperlink r:id="rId157">
         <w:r>
           <w:rPr>
             <w:rStyle w:val="Hyperlink"/>
@@ -5549,8 +5549,8 @@
         </w:r>
       </w:hyperlink>
     </w:p>
-    <w:bookmarkEnd w:id="161"/>
-    <w:bookmarkStart w:id="163" w:name="ref-sotoWhatWhatCan2023"/>
+    <w:bookmarkEnd w:id="158"/>
+    <w:bookmarkStart w:id="160" w:name="ref-sotoWhatWhatCan2023"/>
     <w:p>
       <w:pPr>
         <w:pStyle w:val="Bibliography"/>
@@ -5587,7 +5587,7 @@
       <w:r>
         <w:t xml:space="preserve"> </w:t>
       </w:r>
-      <w:hyperlink r:id="rId162">
+      <w:hyperlink r:id="rId159">
         <w:r>
           <w:rPr>
             <w:rStyle w:val="Hyperlink"/>
@@ -5596,8 +5596,8 @@
         </w:r>
       </w:hyperlink>
     </w:p>
-    <w:bookmarkEnd w:id="163"/>
-    <w:bookmarkStart w:id="165" w:name="Xb082c74c6a7c461c9a2cdf6ff9dd2c10dc4eaf2"/>
+    <w:bookmarkEnd w:id="160"/>
+    <w:bookmarkStart w:id="162" w:name="Xb082c74c6a7c461c9a2cdf6ff9dd2c10dc4eaf2"/>
     <w:p>
       <w:pPr>
         <w:pStyle w:val="Bibliography"/>
@@ -5621,7 +5621,7 @@
       <w:r>
         <w:t xml:space="preserve"> </w:t>
       </w:r>
-      <w:hyperlink r:id="rId164">
+      <w:hyperlink r:id="rId161">
         <w:r>
           <w:rPr>
             <w:rStyle w:val="Hyperlink"/>
@@ -5630,8 +5630,8 @@
         </w:r>
       </w:hyperlink>
     </w:p>
-    <w:bookmarkEnd w:id="165"/>
-    <w:bookmarkStart w:id="167" w:name="ref-sotoGoingTraitsSocial2024"/>
+    <w:bookmarkEnd w:id="162"/>
+    <w:bookmarkStart w:id="164" w:name="ref-sotoGoingTraitsSocial2024"/>
     <w:p>
       <w:pPr>
         <w:pStyle w:val="Bibliography"/>
@@ -5668,7 +5668,7 @@
       <w:r>
         <w:t xml:space="preserve"> </w:t>
       </w:r>
-      <w:hyperlink r:id="rId166">
+      <w:hyperlink r:id="rId163">
         <w:r>
           <w:rPr>
             <w:rStyle w:val="Hyperlink"/>
@@ -5677,8 +5677,8 @@
         </w:r>
       </w:hyperlink>
     </w:p>
-    <w:bookmarkEnd w:id="167"/>
-    <w:bookmarkStart w:id="169" w:name="Xeb49fc8e4a552eaeb28cd937bde333a24559a16"/>
+    <w:bookmarkEnd w:id="164"/>
+    <w:bookmarkStart w:id="166" w:name="Xeb49fc8e4a552eaeb28cd937bde333a24559a16"/>
     <w:p>
       <w:pPr>
         <w:pStyle w:val="Bibliography"/>
@@ -5715,7 +5715,7 @@
       <w:r>
         <w:t xml:space="preserve"> </w:t>
       </w:r>
-      <w:hyperlink r:id="rId168">
+      <w:hyperlink r:id="rId165">
         <w:r>
           <w:rPr>
             <w:rStyle w:val="Hyperlink"/>
@@ -5724,8 +5724,8 @@
         </w:r>
       </w:hyperlink>
     </w:p>
-    <w:bookmarkEnd w:id="169"/>
-    <w:bookmarkStart w:id="171" w:name="X627e46842d45949ce4b6490f7ea3b83c99a93ee"/>
+    <w:bookmarkEnd w:id="166"/>
+    <w:bookmarkStart w:id="168" w:name="X627e46842d45949ce4b6490f7ea3b83c99a93ee"/>
     <w:p>
       <w:pPr>
         <w:pStyle w:val="Bibliography"/>
@@ -5749,7 +5749,7 @@
       <w:r>
         <w:t xml:space="preserve"> </w:t>
       </w:r>
-      <w:hyperlink r:id="rId170">
+      <w:hyperlink r:id="rId167">
         <w:r>
           <w:rPr>
             <w:rStyle w:val="Hyperlink"/>
@@ -5758,8 +5758,8 @@
         </w:r>
       </w:hyperlink>
     </w:p>
-    <w:bookmarkEnd w:id="171"/>
-    <w:bookmarkStart w:id="173" w:name="Xdc3dd2716fdb7402a9e7be1eed4023169bcca2b"/>
+    <w:bookmarkEnd w:id="168"/>
+    <w:bookmarkStart w:id="170" w:name="Xdc3dd2716fdb7402a9e7be1eed4023169bcca2b"/>
     <w:p>
       <w:pPr>
         <w:pStyle w:val="Bibliography"/>
@@ -5796,7 +5796,7 @@
       <w:r>
         <w:t xml:space="preserve"> </w:t>
       </w:r>
-      <w:hyperlink r:id="rId172">
+      <w:hyperlink r:id="rId169">
         <w:r>
           <w:rPr>
             <w:rStyle w:val="Hyperlink"/>
@@ -5805,8 +5805,8 @@
         </w:r>
       </w:hyperlink>
     </w:p>
-    <w:bookmarkEnd w:id="173"/>
-    <w:bookmarkStart w:id="175" w:name="X0a0820d44a235e1264568fc7754a4326c4f6660"/>
+    <w:bookmarkEnd w:id="170"/>
+    <w:bookmarkStart w:id="172" w:name="X0a0820d44a235e1264568fc7754a4326c4f6660"/>
     <w:p>
       <w:pPr>
         <w:pStyle w:val="Bibliography"/>
@@ -5830,7 +5830,7 @@
       <w:r>
         <w:t xml:space="preserve"> </w:t>
       </w:r>
-      <w:hyperlink r:id="rId174">
+      <w:hyperlink r:id="rId171">
         <w:r>
           <w:rPr>
             <w:rStyle w:val="Hyperlink"/>
@@ -5839,8 +5839,8 @@
         </w:r>
       </w:hyperlink>
     </w:p>
-    <w:bookmarkEnd w:id="175"/>
-    <w:bookmarkStart w:id="177" w:name="ref-yoonExaminingSEBSkills2024"/>
+    <w:bookmarkEnd w:id="172"/>
+    <w:bookmarkStart w:id="174" w:name="ref-yoonExaminingSEBSkills2024"/>
     <w:p>
       <w:pPr>
         <w:pStyle w:val="Bibliography"/>
@@ -5877,7 +5877,7 @@
       <w:r>
         <w:t xml:space="preserve"> </w:t>
       </w:r>
-      <w:hyperlink r:id="rId176">
+      <w:hyperlink r:id="rId173">
         <w:r>
           <w:rPr>
             <w:rStyle w:val="Hyperlink"/>
@@ -5886,9 +5886,9 @@
         </w:r>
       </w:hyperlink>
     </w:p>
-    <w:bookmarkEnd w:id="177"/>
-    <w:bookmarkEnd w:id="178"/>
-    <w:bookmarkStart w:id="180" w:name="tbl-studies-summary"/>
+    <w:bookmarkEnd w:id="174"/>
+    <w:bookmarkEnd w:id="175"/>
+    <w:bookmarkStart w:id="177" w:name="tbl-studies-summary"/>
     <w:p>
       <w:pPr>
         <w:pStyle w:val="FigureTitle"/>
@@ -5905,7 +5905,7 @@
         <w:t xml:space="preserve">Studies included in the review</w:t>
       </w:r>
     </w:p>
-    <w:bookmarkStart w:id="179" w:name="tbl-studies"/>
+    <w:bookmarkStart w:id="176" w:name="tbl-studies"/>
     <w:tbl>
       <w:tblPr>
         <w:tblStyle w:val="Table"/>
@@ -8678,14 +8678,14 @@
         </w:tc>
       </w:tr>
     </w:tbl>
-    <w:bookmarkEnd w:id="179"/>
-    <w:bookmarkEnd w:id="180"/>
+    <w:bookmarkEnd w:id="176"/>
+    <w:bookmarkEnd w:id="177"/>
     <w:p>
       <w:r>
         <w:br w:type="page"/>
       </w:r>
     </w:p>
-    <w:bookmarkStart w:id="181" w:name="tbl-meta-results"/>
+    <w:bookmarkStart w:id="178" w:name="tbl-meta-results"/>
     <w:p>
       <w:pPr>
         <w:pStyle w:val="FigureTitle"/>
@@ -8743,7 +8743,6 @@
           </w:tcPr>
           <w:p>
             <w:pPr>
-              <w:pStyle w:pstlname="Normal"/>
               <w:jc w:val="center"/>
               <w:pBdr>
                 <w:bottom w:val="none" w:sz="0" w:space="0" w:color="000000"/>
@@ -8796,7 +8795,6 @@
           </w:tcPr>
           <w:p>
             <w:pPr>
-              <w:pStyle w:pstlname="Normal"/>
               <w:jc w:val="center"/>
               <w:pBdr>
                 <w:bottom w:val="none" w:sz="0" w:space="0" w:color="000000"/>
@@ -8849,7 +8847,6 @@
           </w:tcPr>
           <w:p>
             <w:pPr>
-              <w:pStyle w:pstlname="Normal"/>
               <w:jc w:val="center"/>
               <w:pBdr>
                 <w:bottom w:val="none" w:sz="0" w:space="0" w:color="000000"/>
@@ -8902,7 +8899,6 @@
           </w:tcPr>
           <w:p>
             <w:pPr>
-              <w:pStyle w:pstlname="Normal"/>
               <w:jc w:val="center"/>
               <w:pBdr>
                 <w:bottom w:val="none" w:sz="0" w:space="0" w:color="000000"/>
@@ -8955,7 +8951,6 @@
           </w:tcPr>
           <w:p>
             <w:pPr>
-              <w:pStyle w:pstlname="Normal"/>
               <w:jc w:val="center"/>
               <w:pBdr>
                 <w:bottom w:val="none" w:sz="0" w:space="0" w:color="000000"/>
@@ -9008,7 +9003,6 @@
           </w:tcPr>
           <w:p>
             <w:pPr>
-              <w:pStyle w:pstlname="Normal"/>
               <w:jc w:val="center"/>
               <w:pBdr>
                 <w:bottom w:val="none" w:sz="0" w:space="0" w:color="000000"/>
@@ -9061,7 +9055,6 @@
           </w:tcPr>
           <w:p>
             <w:pPr>
-              <w:pStyle w:pstlname="Normal"/>
               <w:jc w:val="center"/>
               <w:pBdr>
                 <w:bottom w:val="none" w:sz="0" w:space="0" w:color="000000"/>
@@ -9114,7 +9107,6 @@
           </w:tcPr>
           <w:p>
             <w:pPr>
-              <w:pStyle w:pstlname="Normal"/>
               <w:jc w:val="center"/>
               <w:pBdr>
                 <w:bottom w:val="none" w:sz="0" w:space="0" w:color="000000"/>
@@ -9173,7 +9165,6 @@
           </w:tcPr>
           <w:p>
             <w:pPr>
-              <w:pStyle w:pstlname="Normal"/>
               <w:jc w:val="center"/>
               <w:pBdr>
                 <w:bottom w:val="none" w:sz="0" w:space="0" w:color="000000"/>
@@ -9226,7 +9217,6 @@
           </w:tcPr>
           <w:p>
             <w:pPr>
-              <w:pStyle w:pstlname="Normal"/>
               <w:jc w:val="center"/>
               <w:pBdr>
                 <w:bottom w:val="none" w:sz="0" w:space="0" w:color="000000"/>
@@ -9279,7 +9269,6 @@
           </w:tcPr>
           <w:p>
             <w:pPr>
-              <w:pStyle w:pstlname="Normal"/>
               <w:jc w:val="center"/>
               <w:pBdr>
                 <w:bottom w:val="none" w:sz="0" w:space="0" w:color="000000"/>
@@ -9332,7 +9321,6 @@
           </w:tcPr>
           <w:p>
             <w:pPr>
-              <w:pStyle w:pstlname="Normal"/>
               <w:jc w:val="center"/>
               <w:pBdr>
                 <w:bottom w:val="none" w:sz="0" w:space="0" w:color="000000"/>
@@ -9385,7 +9373,6 @@
           </w:tcPr>
           <w:p>
             <w:pPr>
-              <w:pStyle w:pstlname="Normal"/>
               <w:jc w:val="center"/>
               <w:pBdr>
                 <w:bottom w:val="none" w:sz="0" w:space="0" w:color="000000"/>
@@ -9438,7 +9425,6 @@
           </w:tcPr>
           <w:p>
             <w:pPr>
-              <w:pStyle w:pstlname="Normal"/>
               <w:jc w:val="center"/>
               <w:pBdr>
                 <w:bottom w:val="none" w:sz="0" w:space="0" w:color="000000"/>
@@ -9491,7 +9477,6 @@
           </w:tcPr>
           <w:p>
             <w:pPr>
-              <w:pStyle w:pstlname="Normal"/>
               <w:jc w:val="center"/>
               <w:pBdr>
                 <w:bottom w:val="none" w:sz="0" w:space="0" w:color="000000"/>
@@ -9544,7 +9529,6 @@
           </w:tcPr>
           <w:p>
             <w:pPr>
-              <w:pStyle w:pstlname="Normal"/>
               <w:jc w:val="center"/>
               <w:pBdr>
                 <w:bottom w:val="none" w:sz="0" w:space="0" w:color="000000"/>
@@ -9603,7 +9587,6 @@
           </w:tcPr>
           <w:p>
             <w:pPr>
-              <w:pStyle w:pstlname="Normal"/>
               <w:jc w:val="center"/>
               <w:pBdr>
                 <w:bottom w:val="none" w:sz="0" w:space="0" w:color="000000"/>
@@ -9656,7 +9639,6 @@
           </w:tcPr>
           <w:p>
             <w:pPr>
-              <w:pStyle w:pstlname="Normal"/>
               <w:jc w:val="center"/>
               <w:pBdr>
                 <w:bottom w:val="none" w:sz="0" w:space="0" w:color="000000"/>
@@ -9709,7 +9691,6 @@
           </w:tcPr>
           <w:p>
             <w:pPr>
-              <w:pStyle w:pstlname="Normal"/>
               <w:jc w:val="center"/>
               <w:pBdr>
                 <w:bottom w:val="none" w:sz="0" w:space="0" w:color="000000"/>
@@ -9762,7 +9743,6 @@
           </w:tcPr>
           <w:p>
             <w:pPr>
-              <w:pStyle w:pstlname="Normal"/>
               <w:jc w:val="center"/>
               <w:pBdr>
                 <w:bottom w:val="none" w:sz="0" w:space="0" w:color="000000"/>
@@ -9815,7 +9795,6 @@
           </w:tcPr>
           <w:p>
             <w:pPr>
-              <w:pStyle w:pstlname="Normal"/>
               <w:jc w:val="center"/>
               <w:pBdr>
                 <w:bottom w:val="none" w:sz="0" w:space="0" w:color="000000"/>
@@ -9868,7 +9847,6 @@
           </w:tcPr>
           <w:p>
             <w:pPr>
-              <w:pStyle w:pstlname="Normal"/>
               <w:jc w:val="center"/>
               <w:pBdr>
                 <w:bottom w:val="none" w:sz="0" w:space="0" w:color="000000"/>
@@ -9921,7 +9899,6 @@
           </w:tcPr>
           <w:p>
             <w:pPr>
-              <w:pStyle w:pstlname="Normal"/>
               <w:jc w:val="center"/>
               <w:pBdr>
                 <w:bottom w:val="none" w:sz="0" w:space="0" w:color="000000"/>
@@ -9974,7 +9951,6 @@
           </w:tcPr>
           <w:p>
             <w:pPr>
-              <w:pStyle w:pstlname="Normal"/>
               <w:jc w:val="center"/>
               <w:pBdr>
                 <w:bottom w:val="none" w:sz="0" w:space="0" w:color="000000"/>
@@ -10033,7 +10009,6 @@
           </w:tcPr>
           <w:p>
             <w:pPr>
-              <w:pStyle w:pstlname="Normal"/>
               <w:jc w:val="center"/>
               <w:pBdr>
                 <w:bottom w:val="none" w:sz="0" w:space="0" w:color="000000"/>
@@ -10086,7 +10061,6 @@
           </w:tcPr>
           <w:p>
             <w:pPr>
-              <w:pStyle w:pstlname="Normal"/>
               <w:jc w:val="center"/>
               <w:pBdr>
                 <w:bottom w:val="none" w:sz="0" w:space="0" w:color="000000"/>
@@ -10139,7 +10113,6 @@
           </w:tcPr>
           <w:p>
             <w:pPr>
-              <w:pStyle w:pstlname="Normal"/>
               <w:jc w:val="center"/>
               <w:pBdr>
                 <w:bottom w:val="none" w:sz="0" w:space="0" w:color="000000"/>
@@ -10192,7 +10165,6 @@
           </w:tcPr>
           <w:p>
             <w:pPr>
-              <w:pStyle w:pstlname="Normal"/>
               <w:jc w:val="center"/>
               <w:pBdr>
                 <w:bottom w:val="none" w:sz="0" w:space="0" w:color="000000"/>
@@ -10245,7 +10217,6 @@
           </w:tcPr>
           <w:p>
             <w:pPr>
-              <w:pStyle w:pstlname="Normal"/>
               <w:jc w:val="center"/>
               <w:pBdr>
                 <w:bottom w:val="none" w:sz="0" w:space="0" w:color="000000"/>
@@ -10298,7 +10269,6 @@
           </w:tcPr>
           <w:p>
             <w:pPr>
-              <w:pStyle w:pstlname="Normal"/>
               <w:jc w:val="center"/>
               <w:pBdr>
                 <w:bottom w:val="none" w:sz="0" w:space="0" w:color="000000"/>
@@ -10351,7 +10321,6 @@
           </w:tcPr>
           <w:p>
             <w:pPr>
-              <w:pStyle w:pstlname="Normal"/>
               <w:jc w:val="center"/>
               <w:pBdr>
                 <w:bottom w:val="none" w:sz="0" w:space="0" w:color="000000"/>
@@ -10404,7 +10373,6 @@
           </w:tcPr>
           <w:p>
             <w:pPr>
-              <w:pStyle w:pstlname="Normal"/>
               <w:jc w:val="center"/>
               <w:pBdr>
                 <w:bottom w:val="none" w:sz="0" w:space="0" w:color="000000"/>
@@ -10463,7 +10431,6 @@
           </w:tcPr>
           <w:p>
             <w:pPr>
-              <w:pStyle w:pstlname="Normal"/>
               <w:jc w:val="center"/>
               <w:pBdr>
                 <w:bottom w:val="none" w:sz="0" w:space="0" w:color="000000"/>
@@ -10516,7 +10483,6 @@
           </w:tcPr>
           <w:p>
             <w:pPr>
-              <w:pStyle w:pstlname="Normal"/>
               <w:jc w:val="center"/>
               <w:pBdr>
                 <w:bottom w:val="none" w:sz="0" w:space="0" w:color="000000"/>
@@ -10569,7 +10535,6 @@
           </w:tcPr>
           <w:p>
             <w:pPr>
-              <w:pStyle w:pstlname="Normal"/>
               <w:jc w:val="center"/>
               <w:pBdr>
                 <w:bottom w:val="none" w:sz="0" w:space="0" w:color="000000"/>
@@ -10622,7 +10587,6 @@
           </w:tcPr>
           <w:p>
             <w:pPr>
-              <w:pStyle w:pstlname="Normal"/>
               <w:jc w:val="center"/>
               <w:pBdr>
                 <w:bottom w:val="none" w:sz="0" w:space="0" w:color="000000"/>
@@ -10675,7 +10639,6 @@
           </w:tcPr>
           <w:p>
             <w:pPr>
-              <w:pStyle w:pstlname="Normal"/>
               <w:jc w:val="center"/>
               <w:pBdr>
                 <w:bottom w:val="none" w:sz="0" w:space="0" w:color="000000"/>
@@ -10728,7 +10691,6 @@
           </w:tcPr>
           <w:p>
             <w:pPr>
-              <w:pStyle w:pstlname="Normal"/>
               <w:jc w:val="center"/>
               <w:pBdr>
                 <w:bottom w:val="none" w:sz="0" w:space="0" w:color="000000"/>
@@ -10781,7 +10743,6 @@
           </w:tcPr>
           <w:p>
             <w:pPr>
-              <w:pStyle w:pstlname="Normal"/>
               <w:jc w:val="center"/>
               <w:pBdr>
                 <w:bottom w:val="none" w:sz="0" w:space="0" w:color="000000"/>
@@ -10834,7 +10795,6 @@
           </w:tcPr>
           <w:p>
             <w:pPr>
-              <w:pStyle w:pstlname="Normal"/>
               <w:jc w:val="center"/>
               <w:pBdr>
                 <w:bottom w:val="none" w:sz="0" w:space="0" w:color="000000"/>
@@ -10893,7 +10853,6 @@
           </w:tcPr>
           <w:p>
             <w:pPr>
-              <w:pStyle w:pstlname="Normal"/>
               <w:jc w:val="center"/>
               <w:pBdr>
                 <w:bottom w:val="none" w:sz="0" w:space="0" w:color="000000"/>
@@ -10946,7 +10905,6 @@
           </w:tcPr>
           <w:p>
             <w:pPr>
-              <w:pStyle w:pstlname="Normal"/>
               <w:jc w:val="center"/>
               <w:pBdr>
                 <w:bottom w:val="none" w:sz="0" w:space="0" w:color="000000"/>
@@ -10999,7 +10957,6 @@
           </w:tcPr>
           <w:p>
             <w:pPr>
-              <w:pStyle w:pstlname="Normal"/>
               <w:jc w:val="center"/>
               <w:pBdr>
                 <w:bottom w:val="none" w:sz="0" w:space="0" w:color="000000"/>
@@ -11052,7 +11009,6 @@
           </w:tcPr>
           <w:p>
             <w:pPr>
-              <w:pStyle w:pstlname="Normal"/>
               <w:jc w:val="center"/>
               <w:pBdr>
                 <w:bottom w:val="none" w:sz="0" w:space="0" w:color="000000"/>
@@ -11105,7 +11061,6 @@
           </w:tcPr>
           <w:p>
             <w:pPr>
-              <w:pStyle w:pstlname="Normal"/>
               <w:jc w:val="center"/>
               <w:pBdr>
                 <w:bottom w:val="none" w:sz="0" w:space="0" w:color="000000"/>
@@ -11158,7 +11113,6 @@
           </w:tcPr>
           <w:p>
             <w:pPr>
-              <w:pStyle w:pstlname="Normal"/>
               <w:jc w:val="center"/>
               <w:pBdr>
                 <w:bottom w:val="none" w:sz="0" w:space="0" w:color="000000"/>
@@ -11211,7 +11165,6 @@
           </w:tcPr>
           <w:p>
             <w:pPr>
-              <w:pStyle w:pstlname="Normal"/>
               <w:jc w:val="center"/>
               <w:pBdr>
                 <w:bottom w:val="none" w:sz="0" w:space="0" w:color="000000"/>
@@ -11264,7 +11217,6 @@
           </w:tcPr>
           <w:p>
             <w:pPr>
-              <w:pStyle w:pstlname="Normal"/>
               <w:jc w:val="center"/>
               <w:pBdr>
                 <w:bottom w:val="none" w:sz="0" w:space="0" w:color="000000"/>
@@ -11300,7 +11252,7 @@
         </w:tc>
       </w:tr>
     </w:tbl>
-    <w:bookmarkEnd w:id="181"/>
+    <w:bookmarkEnd w:id="178"/>
     <w:p>
       <w:pPr>
         <w:pStyle w:val="FigureNote"/>
@@ -11369,7 +11321,7 @@
         <w:br w:type="page"/>
       </w:r>
     </w:p>
-    <w:bookmarkStart w:id="182" w:name="tbl-osmasem-summary"/>
+    <w:bookmarkStart w:id="179" w:name="tbl-osmasem-summary"/>
     <w:p>
       <w:pPr>
         <w:pStyle w:val="FigureTitle"/>
@@ -11426,7 +11378,6 @@
           </w:tcPr>
           <w:p>
             <w:pPr>
-              <w:pStyle w:pstlname="Normal"/>
               <w:jc w:val="center"/>
               <w:pBdr>
                 <w:bottom w:val="none" w:sz="0" w:space="0" w:color="000000"/>
@@ -11479,7 +11430,6 @@
           </w:tcPr>
           <w:p>
             <w:pPr>
-              <w:pStyle w:pstlname="Normal"/>
               <w:jc w:val="center"/>
               <w:pBdr>
                 <w:bottom w:val="none" w:sz="0" w:space="0" w:color="000000"/>
@@ -11532,7 +11482,6 @@
           </w:tcPr>
           <w:p>
             <w:pPr>
-              <w:pStyle w:pstlname="Normal"/>
               <w:jc w:val="center"/>
               <w:pBdr>
                 <w:bottom w:val="none" w:sz="0" w:space="0" w:color="000000"/>
@@ -11585,7 +11534,6 @@
           </w:tcPr>
           <w:p>
             <w:pPr>
-              <w:pStyle w:pstlname="Normal"/>
               <w:jc w:val="center"/>
               <w:pBdr>
                 <w:bottom w:val="none" w:sz="0" w:space="0" w:color="000000"/>
@@ -11638,7 +11586,6 @@
           </w:tcPr>
           <w:p>
             <w:pPr>
-              <w:pStyle w:pstlname="Normal"/>
               <w:jc w:val="center"/>
               <w:pBdr>
                 <w:bottom w:val="none" w:sz="0" w:space="0" w:color="000000"/>
@@ -11691,7 +11638,6 @@
           </w:tcPr>
           <w:p>
             <w:pPr>
-              <w:pStyle w:pstlname="Normal"/>
               <w:jc w:val="center"/>
               <w:pBdr>
                 <w:bottom w:val="none" w:sz="0" w:space="0" w:color="000000"/>
@@ -11744,7 +11690,6 @@
           </w:tcPr>
           <w:p>
             <w:pPr>
-              <w:pStyle w:pstlname="Normal"/>
               <w:jc w:val="center"/>
               <w:pBdr>
                 <w:bottom w:val="none" w:sz="0" w:space="0" w:color="000000"/>
@@ -11803,7 +11748,6 @@
           </w:tcPr>
           <w:p>
             <w:pPr>
-              <w:pStyle w:pstlname="Normal"/>
               <w:jc w:val="center"/>
               <w:pBdr>
                 <w:bottom w:val="none" w:sz="0" w:space="0" w:color="000000"/>
@@ -11856,7 +11800,6 @@
           </w:tcPr>
           <w:p>
             <w:pPr>
-              <w:pStyle w:pstlname="Normal"/>
               <w:jc w:val="center"/>
               <w:pBdr>
                 <w:bottom w:val="none" w:sz="0" w:space="0" w:color="000000"/>
@@ -11909,7 +11852,6 @@
           </w:tcPr>
           <w:p>
             <w:pPr>
-              <w:pStyle w:pstlname="Normal"/>
               <w:jc w:val="center"/>
               <w:pBdr>
                 <w:bottom w:val="none" w:sz="0" w:space="0" w:color="000000"/>
@@ -11962,7 +11904,6 @@
           </w:tcPr>
           <w:p>
             <w:pPr>
-              <w:pStyle w:pstlname="Normal"/>
               <w:jc w:val="center"/>
               <w:pBdr>
                 <w:bottom w:val="none" w:sz="0" w:space="0" w:color="000000"/>
@@ -12015,7 +11956,6 @@
           </w:tcPr>
           <w:p>
             <w:pPr>
-              <w:pStyle w:pstlname="Normal"/>
               <w:jc w:val="center"/>
               <w:pBdr>
                 <w:bottom w:val="none" w:sz="0" w:space="0" w:color="000000"/>
@@ -12045,7 +11985,7 @@
                 <w:szCs w:val="20"/>
                 <w:color w:val="000000"/>
               </w:rPr>
-              <w:t xml:space="preserve">0.03</w:t>
+              <w:t xml:space="preserve">0.02</w:t>
             </w:r>
           </w:p>
         </w:tc>
@@ -12068,7 +12008,6 @@
           </w:tcPr>
           <w:p>
             <w:pPr>
-              <w:pStyle w:pstlname="Normal"/>
               <w:jc w:val="center"/>
               <w:pBdr>
                 <w:bottom w:val="none" w:sz="0" w:space="0" w:color="000000"/>
@@ -12121,7 +12060,6 @@
           </w:tcPr>
           <w:p>
             <w:pPr>
-              <w:pStyle w:pstlname="Normal"/>
               <w:jc w:val="center"/>
               <w:pBdr>
                 <w:bottom w:val="none" w:sz="0" w:space="0" w:color="000000"/>
@@ -12180,7 +12118,6 @@
           </w:tcPr>
           <w:p>
             <w:pPr>
-              <w:pStyle w:pstlname="Normal"/>
               <w:jc w:val="center"/>
               <w:pBdr>
                 <w:bottom w:val="none" w:sz="0" w:space="0" w:color="000000"/>
@@ -12233,7 +12170,6 @@
           </w:tcPr>
           <w:p>
             <w:pPr>
-              <w:pStyle w:pstlname="Normal"/>
               <w:jc w:val="center"/>
               <w:pBdr>
                 <w:bottom w:val="none" w:sz="0" w:space="0" w:color="000000"/>
@@ -12286,7 +12222,6 @@
           </w:tcPr>
           <w:p>
             <w:pPr>
-              <w:pStyle w:pstlname="Normal"/>
               <w:jc w:val="center"/>
               <w:pBdr>
                 <w:bottom w:val="none" w:sz="0" w:space="0" w:color="000000"/>
@@ -12339,7 +12274,6 @@
           </w:tcPr>
           <w:p>
             <w:pPr>
-              <w:pStyle w:pstlname="Normal"/>
               <w:jc w:val="center"/>
               <w:pBdr>
                 <w:bottom w:val="none" w:sz="0" w:space="0" w:color="000000"/>
@@ -12392,7 +12326,6 @@
           </w:tcPr>
           <w:p>
             <w:pPr>
-              <w:pStyle w:pstlname="Normal"/>
               <w:jc w:val="center"/>
               <w:pBdr>
                 <w:bottom w:val="none" w:sz="0" w:space="0" w:color="000000"/>
@@ -12445,7 +12378,6 @@
           </w:tcPr>
           <w:p>
             <w:pPr>
-              <w:pStyle w:pstlname="Normal"/>
               <w:jc w:val="center"/>
               <w:pBdr>
                 <w:bottom w:val="none" w:sz="0" w:space="0" w:color="000000"/>
@@ -12498,7 +12430,6 @@
           </w:tcPr>
           <w:p>
             <w:pPr>
-              <w:pStyle w:pstlname="Normal"/>
               <w:jc w:val="center"/>
               <w:pBdr>
                 <w:bottom w:val="none" w:sz="0" w:space="0" w:color="000000"/>
@@ -12557,7 +12488,6 @@
           </w:tcPr>
           <w:p>
             <w:pPr>
-              <w:pStyle w:pstlname="Normal"/>
               <w:jc w:val="center"/>
               <w:pBdr>
                 <w:bottom w:val="none" w:sz="0" w:space="0" w:color="000000"/>
@@ -12610,7 +12540,6 @@
           </w:tcPr>
           <w:p>
             <w:pPr>
-              <w:pStyle w:pstlname="Normal"/>
               <w:jc w:val="center"/>
               <w:pBdr>
                 <w:bottom w:val="none" w:sz="0" w:space="0" w:color="000000"/>
@@ -12663,7 +12592,6 @@
           </w:tcPr>
           <w:p>
             <w:pPr>
-              <w:pStyle w:pstlname="Normal"/>
               <w:jc w:val="center"/>
               <w:pBdr>
                 <w:bottom w:val="none" w:sz="0" w:space="0" w:color="000000"/>
@@ -12716,7 +12644,6 @@
           </w:tcPr>
           <w:p>
             <w:pPr>
-              <w:pStyle w:pstlname="Normal"/>
               <w:jc w:val="center"/>
               <w:pBdr>
                 <w:bottom w:val="none" w:sz="0" w:space="0" w:color="000000"/>
@@ -12769,7 +12696,6 @@
           </w:tcPr>
           <w:p>
             <w:pPr>
-              <w:pStyle w:pstlname="Normal"/>
               <w:jc w:val="center"/>
               <w:pBdr>
                 <w:bottom w:val="none" w:sz="0" w:space="0" w:color="000000"/>
@@ -12822,7 +12748,6 @@
           </w:tcPr>
           <w:p>
             <w:pPr>
-              <w:pStyle w:pstlname="Normal"/>
               <w:jc w:val="center"/>
               <w:pBdr>
                 <w:bottom w:val="none" w:sz="0" w:space="0" w:color="000000"/>
@@ -12875,7 +12800,6 @@
           </w:tcPr>
           <w:p>
             <w:pPr>
-              <w:pStyle w:pstlname="Normal"/>
               <w:jc w:val="center"/>
               <w:pBdr>
                 <w:bottom w:val="none" w:sz="0" w:space="0" w:color="000000"/>
@@ -12934,7 +12858,6 @@
           </w:tcPr>
           <w:p>
             <w:pPr>
-              <w:pStyle w:pstlname="Normal"/>
               <w:jc w:val="center"/>
               <w:pBdr>
                 <w:bottom w:val="none" w:sz="0" w:space="0" w:color="000000"/>
@@ -12987,7 +12910,6 @@
           </w:tcPr>
           <w:p>
             <w:pPr>
-              <w:pStyle w:pstlname="Normal"/>
               <w:jc w:val="center"/>
               <w:pBdr>
                 <w:bottom w:val="none" w:sz="0" w:space="0" w:color="000000"/>
@@ -13040,7 +12962,6 @@
           </w:tcPr>
           <w:p>
             <w:pPr>
-              <w:pStyle w:pstlname="Normal"/>
               <w:jc w:val="center"/>
               <w:pBdr>
                 <w:bottom w:val="none" w:sz="0" w:space="0" w:color="000000"/>
@@ -13093,7 +13014,6 @@
           </w:tcPr>
           <w:p>
             <w:pPr>
-              <w:pStyle w:pstlname="Normal"/>
               <w:jc w:val="center"/>
               <w:pBdr>
                 <w:bottom w:val="none" w:sz="0" w:space="0" w:color="000000"/>
@@ -13146,7 +13066,6 @@
           </w:tcPr>
           <w:p>
             <w:pPr>
-              <w:pStyle w:pstlname="Normal"/>
               <w:jc w:val="center"/>
               <w:pBdr>
                 <w:bottom w:val="none" w:sz="0" w:space="0" w:color="000000"/>
@@ -13199,7 +13118,6 @@
           </w:tcPr>
           <w:p>
             <w:pPr>
-              <w:pStyle w:pstlname="Normal"/>
               <w:jc w:val="center"/>
               <w:pBdr>
                 <w:bottom w:val="none" w:sz="0" w:space="0" w:color="000000"/>
@@ -13252,7 +13170,6 @@
           </w:tcPr>
           <w:p>
             <w:pPr>
-              <w:pStyle w:pstlname="Normal"/>
               <w:jc w:val="center"/>
               <w:pBdr>
                 <w:bottom w:val="none" w:sz="0" w:space="0" w:color="000000"/>
@@ -13311,7 +13228,6 @@
           </w:tcPr>
           <w:p>
             <w:pPr>
-              <w:pStyle w:pstlname="Normal"/>
               <w:jc w:val="center"/>
               <w:pBdr>
                 <w:bottom w:val="none" w:sz="0" w:space="0" w:color="000000"/>
@@ -13364,7 +13280,6 @@
           </w:tcPr>
           <w:p>
             <w:pPr>
-              <w:pStyle w:pstlname="Normal"/>
               <w:jc w:val="center"/>
               <w:pBdr>
                 <w:bottom w:val="none" w:sz="0" w:space="0" w:color="000000"/>
@@ -13417,7 +13332,6 @@
           </w:tcPr>
           <w:p>
             <w:pPr>
-              <w:pStyle w:pstlname="Normal"/>
               <w:jc w:val="center"/>
               <w:pBdr>
                 <w:bottom w:val="none" w:sz="0" w:space="0" w:color="000000"/>
@@ -13470,7 +13384,6 @@
           </w:tcPr>
           <w:p>
             <w:pPr>
-              <w:pStyle w:pstlname="Normal"/>
               <w:jc w:val="center"/>
               <w:pBdr>
                 <w:bottom w:val="none" w:sz="0" w:space="0" w:color="000000"/>
@@ -13523,7 +13436,6 @@
           </w:tcPr>
           <w:p>
             <w:pPr>
-              <w:pStyle w:pstlname="Normal"/>
               <w:jc w:val="center"/>
               <w:pBdr>
                 <w:bottom w:val="none" w:sz="0" w:space="0" w:color="000000"/>
@@ -13576,7 +13488,6 @@
           </w:tcPr>
           <w:p>
             <w:pPr>
-              <w:pStyle w:pstlname="Normal"/>
               <w:jc w:val="center"/>
               <w:pBdr>
                 <w:bottom w:val="none" w:sz="0" w:space="0" w:color="000000"/>
@@ -13629,7 +13540,6 @@
           </w:tcPr>
           <w:p>
             <w:pPr>
-              <w:pStyle w:pstlname="Normal"/>
               <w:jc w:val="center"/>
               <w:pBdr>
                 <w:bottom w:val="none" w:sz="0" w:space="0" w:color="000000"/>
@@ -13688,7 +13598,6 @@
           </w:tcPr>
           <w:p>
             <w:pPr>
-              <w:pStyle w:pstlname="Normal"/>
               <w:jc w:val="center"/>
               <w:pBdr>
                 <w:bottom w:val="none" w:sz="0" w:space="0" w:color="000000"/>
@@ -13741,7 +13650,6 @@
           </w:tcPr>
           <w:p>
             <w:pPr>
-              <w:pStyle w:pstlname="Normal"/>
               <w:jc w:val="center"/>
               <w:pBdr>
                 <w:bottom w:val="none" w:sz="0" w:space="0" w:color="000000"/>
@@ -13794,7 +13702,6 @@
           </w:tcPr>
           <w:p>
             <w:pPr>
-              <w:pStyle w:pstlname="Normal"/>
               <w:jc w:val="center"/>
               <w:pBdr>
                 <w:bottom w:val="none" w:sz="0" w:space="0" w:color="000000"/>
@@ -13847,7 +13754,6 @@
           </w:tcPr>
           <w:p>
             <w:pPr>
-              <w:pStyle w:pstlname="Normal"/>
               <w:jc w:val="center"/>
               <w:pBdr>
                 <w:bottom w:val="none" w:sz="0" w:space="0" w:color="000000"/>
@@ -13900,7 +13806,6 @@
           </w:tcPr>
           <w:p>
             <w:pPr>
-              <w:pStyle w:pstlname="Normal"/>
               <w:jc w:val="center"/>
               <w:pBdr>
                 <w:bottom w:val="none" w:sz="0" w:space="0" w:color="000000"/>
@@ -13953,7 +13858,6 @@
           </w:tcPr>
           <w:p>
             <w:pPr>
-              <w:pStyle w:pstlname="Normal"/>
               <w:jc w:val="center"/>
               <w:pBdr>
                 <w:bottom w:val="none" w:sz="0" w:space="0" w:color="000000"/>
@@ -14006,7 +13910,6 @@
           </w:tcPr>
           <w:p>
             <w:pPr>
-              <w:pStyle w:pstlname="Normal"/>
               <w:jc w:val="center"/>
               <w:pBdr>
                 <w:bottom w:val="none" w:sz="0" w:space="0" w:color="000000"/>
@@ -14065,7 +13968,6 @@
           </w:tcPr>
           <w:p>
             <w:pPr>
-              <w:pStyle w:pstlname="Normal"/>
               <w:jc w:val="center"/>
               <w:pBdr>
                 <w:bottom w:val="none" w:sz="0" w:space="0" w:color="000000"/>
@@ -14118,7 +14020,6 @@
           </w:tcPr>
           <w:p>
             <w:pPr>
-              <w:pStyle w:pstlname="Normal"/>
               <w:jc w:val="center"/>
               <w:pBdr>
                 <w:bottom w:val="none" w:sz="0" w:space="0" w:color="000000"/>
@@ -14171,7 +14072,6 @@
           </w:tcPr>
           <w:p>
             <w:pPr>
-              <w:pStyle w:pstlname="Normal"/>
               <w:jc w:val="center"/>
               <w:pBdr>
                 <w:bottom w:val="none" w:sz="0" w:space="0" w:color="000000"/>
@@ -14224,7 +14124,6 @@
           </w:tcPr>
           <w:p>
             <w:pPr>
-              <w:pStyle w:pstlname="Normal"/>
               <w:jc w:val="center"/>
               <w:pBdr>
                 <w:bottom w:val="none" w:sz="0" w:space="0" w:color="000000"/>
@@ -14277,7 +14176,6 @@
           </w:tcPr>
           <w:p>
             <w:pPr>
-              <w:pStyle w:pstlname="Normal"/>
               <w:jc w:val="center"/>
               <w:pBdr>
                 <w:bottom w:val="none" w:sz="0" w:space="0" w:color="000000"/>
@@ -14330,7 +14228,6 @@
           </w:tcPr>
           <w:p>
             <w:pPr>
-              <w:pStyle w:pstlname="Normal"/>
               <w:jc w:val="center"/>
               <w:pBdr>
                 <w:bottom w:val="none" w:sz="0" w:space="0" w:color="000000"/>
@@ -14383,7 +14280,6 @@
           </w:tcPr>
           <w:p>
             <w:pPr>
-              <w:pStyle w:pstlname="Normal"/>
               <w:jc w:val="center"/>
               <w:pBdr>
                 <w:bottom w:val="none" w:sz="0" w:space="0" w:color="000000"/>
@@ -14442,7 +14338,6 @@
           </w:tcPr>
           <w:p>
             <w:pPr>
-              <w:pStyle w:pstlname="Normal"/>
               <w:jc w:val="center"/>
               <w:pBdr>
                 <w:bottom w:val="none" w:sz="0" w:space="0" w:color="000000"/>
@@ -14495,7 +14390,6 @@
           </w:tcPr>
           <w:p>
             <w:pPr>
-              <w:pStyle w:pstlname="Normal"/>
               <w:jc w:val="center"/>
               <w:pBdr>
                 <w:bottom w:val="none" w:sz="0" w:space="0" w:color="000000"/>
@@ -14548,7 +14442,6 @@
           </w:tcPr>
           <w:p>
             <w:pPr>
-              <w:pStyle w:pstlname="Normal"/>
               <w:jc w:val="center"/>
               <w:pBdr>
                 <w:bottom w:val="none" w:sz="0" w:space="0" w:color="000000"/>
@@ -14601,7 +14494,6 @@
           </w:tcPr>
           <w:p>
             <w:pPr>
-              <w:pStyle w:pstlname="Normal"/>
               <w:jc w:val="center"/>
               <w:pBdr>
                 <w:bottom w:val="none" w:sz="0" w:space="0" w:color="000000"/>
@@ -14654,7 +14546,6 @@
           </w:tcPr>
           <w:p>
             <w:pPr>
-              <w:pStyle w:pstlname="Normal"/>
               <w:jc w:val="center"/>
               <w:pBdr>
                 <w:bottom w:val="none" w:sz="0" w:space="0" w:color="000000"/>
@@ -14707,7 +14598,6 @@
           </w:tcPr>
           <w:p>
             <w:pPr>
-              <w:pStyle w:pstlname="Normal"/>
               <w:jc w:val="center"/>
               <w:pBdr>
                 <w:bottom w:val="none" w:sz="0" w:space="0" w:color="000000"/>
@@ -14760,7 +14650,6 @@
           </w:tcPr>
           <w:p>
             <w:pPr>
-              <w:pStyle w:pstlname="Normal"/>
               <w:jc w:val="center"/>
               <w:pBdr>
                 <w:bottom w:val="none" w:sz="0" w:space="0" w:color="000000"/>
@@ -14819,7 +14708,6 @@
           </w:tcPr>
           <w:p>
             <w:pPr>
-              <w:pStyle w:pstlname="Normal"/>
               <w:jc w:val="center"/>
               <w:pBdr>
                 <w:bottom w:val="none" w:sz="0" w:space="0" w:color="000000"/>
@@ -14872,7 +14760,6 @@
           </w:tcPr>
           <w:p>
             <w:pPr>
-              <w:pStyle w:pstlname="Normal"/>
               <w:jc w:val="center"/>
               <w:pBdr>
                 <w:bottom w:val="none" w:sz="0" w:space="0" w:color="000000"/>
@@ -14925,7 +14812,6 @@
           </w:tcPr>
           <w:p>
             <w:pPr>
-              <w:pStyle w:pstlname="Normal"/>
               <w:jc w:val="center"/>
               <w:pBdr>
                 <w:bottom w:val="none" w:sz="0" w:space="0" w:color="000000"/>
@@ -14978,7 +14864,6 @@
           </w:tcPr>
           <w:p>
             <w:pPr>
-              <w:pStyle w:pstlname="Normal"/>
               <w:jc w:val="center"/>
               <w:pBdr>
                 <w:bottom w:val="none" w:sz="0" w:space="0" w:color="000000"/>
@@ -15031,7 +14916,6 @@
           </w:tcPr>
           <w:p>
             <w:pPr>
-              <w:pStyle w:pstlname="Normal"/>
               <w:jc w:val="center"/>
               <w:pBdr>
                 <w:bottom w:val="none" w:sz="0" w:space="0" w:color="000000"/>
@@ -15061,7 +14945,7 @@
                 <w:szCs w:val="20"/>
                 <w:color w:val="000000"/>
               </w:rPr>
-              <w:t xml:space="preserve">0.01</w:t>
+              <w:t xml:space="preserve">0.00</w:t>
             </w:r>
           </w:p>
         </w:tc>
@@ -15084,7 +14968,6 @@
           </w:tcPr>
           <w:p>
             <w:pPr>
-              <w:pStyle w:pstlname="Normal"/>
               <w:jc w:val="center"/>
               <w:pBdr>
                 <w:bottom w:val="none" w:sz="0" w:space="0" w:color="000000"/>
@@ -15137,7 +15020,6 @@
           </w:tcPr>
           <w:p>
             <w:pPr>
-              <w:pStyle w:pstlname="Normal"/>
               <w:jc w:val="center"/>
               <w:pBdr>
                 <w:bottom w:val="none" w:sz="0" w:space="0" w:color="000000"/>
@@ -15196,7 +15078,6 @@
           </w:tcPr>
           <w:p>
             <w:pPr>
-              <w:pStyle w:pstlname="Normal"/>
               <w:jc w:val="center"/>
               <w:pBdr>
                 <w:bottom w:val="none" w:sz="0" w:space="0" w:color="000000"/>
@@ -15249,7 +15130,6 @@
           </w:tcPr>
           <w:p>
             <w:pPr>
-              <w:pStyle w:pstlname="Normal"/>
               <w:jc w:val="center"/>
               <w:pBdr>
                 <w:bottom w:val="none" w:sz="0" w:space="0" w:color="000000"/>
@@ -15302,7 +15182,6 @@
           </w:tcPr>
           <w:p>
             <w:pPr>
-              <w:pStyle w:pstlname="Normal"/>
               <w:jc w:val="center"/>
               <w:pBdr>
                 <w:bottom w:val="none" w:sz="0" w:space="0" w:color="000000"/>
@@ -15355,7 +15234,6 @@
           </w:tcPr>
           <w:p>
             <w:pPr>
-              <w:pStyle w:pstlname="Normal"/>
               <w:jc w:val="center"/>
               <w:pBdr>
                 <w:bottom w:val="none" w:sz="0" w:space="0" w:color="000000"/>
@@ -15408,7 +15286,6 @@
           </w:tcPr>
           <w:p>
             <w:pPr>
-              <w:pStyle w:pstlname="Normal"/>
               <w:jc w:val="center"/>
               <w:pBdr>
                 <w:bottom w:val="none" w:sz="0" w:space="0" w:color="000000"/>
@@ -15461,7 +15338,6 @@
           </w:tcPr>
           <w:p>
             <w:pPr>
-              <w:pStyle w:pstlname="Normal"/>
               <w:jc w:val="center"/>
               <w:pBdr>
                 <w:bottom w:val="none" w:sz="0" w:space="0" w:color="000000"/>
@@ -15514,7 +15390,6 @@
           </w:tcPr>
           <w:p>
             <w:pPr>
-              <w:pStyle w:pstlname="Normal"/>
               <w:jc w:val="center"/>
               <w:pBdr>
                 <w:bottom w:val="none" w:sz="0" w:space="0" w:color="000000"/>
@@ -15573,7 +15448,6 @@
           </w:tcPr>
           <w:p>
             <w:pPr>
-              <w:pStyle w:pstlname="Normal"/>
               <w:jc w:val="center"/>
               <w:pBdr>
                 <w:bottom w:val="none" w:sz="0" w:space="0" w:color="000000"/>
@@ -15626,7 +15500,6 @@
           </w:tcPr>
           <w:p>
             <w:pPr>
-              <w:pStyle w:pstlname="Normal"/>
               <w:jc w:val="center"/>
               <w:pBdr>
                 <w:bottom w:val="none" w:sz="0" w:space="0" w:color="000000"/>
@@ -15679,7 +15552,6 @@
           </w:tcPr>
           <w:p>
             <w:pPr>
-              <w:pStyle w:pstlname="Normal"/>
               <w:jc w:val="center"/>
               <w:pBdr>
                 <w:bottom w:val="none" w:sz="0" w:space="0" w:color="000000"/>
@@ -15732,7 +15604,6 @@
           </w:tcPr>
           <w:p>
             <w:pPr>
-              <w:pStyle w:pstlname="Normal"/>
               <w:jc w:val="center"/>
               <w:pBdr>
                 <w:bottom w:val="none" w:sz="0" w:space="0" w:color="000000"/>
@@ -15785,7 +15656,6 @@
           </w:tcPr>
           <w:p>
             <w:pPr>
-              <w:pStyle w:pstlname="Normal"/>
               <w:jc w:val="center"/>
               <w:pBdr>
                 <w:bottom w:val="none" w:sz="0" w:space="0" w:color="000000"/>
@@ -15838,7 +15708,6 @@
           </w:tcPr>
           <w:p>
             <w:pPr>
-              <w:pStyle w:pstlname="Normal"/>
               <w:jc w:val="center"/>
               <w:pBdr>
                 <w:bottom w:val="none" w:sz="0" w:space="0" w:color="000000"/>
@@ -15891,7 +15760,6 @@
           </w:tcPr>
           <w:p>
             <w:pPr>
-              <w:pStyle w:pstlname="Normal"/>
               <w:jc w:val="center"/>
               <w:pBdr>
                 <w:bottom w:val="none" w:sz="0" w:space="0" w:color="000000"/>
@@ -15950,7 +15818,6 @@
           </w:tcPr>
           <w:p>
             <w:pPr>
-              <w:pStyle w:pstlname="Normal"/>
               <w:jc w:val="center"/>
               <w:pBdr>
                 <w:bottom w:val="none" w:sz="0" w:space="0" w:color="000000"/>
@@ -16003,7 +15870,6 @@
           </w:tcPr>
           <w:p>
             <w:pPr>
-              <w:pStyle w:pstlname="Normal"/>
               <w:jc w:val="center"/>
               <w:pBdr>
                 <w:bottom w:val="none" w:sz="0" w:space="0" w:color="000000"/>
@@ -16056,7 +15922,6 @@
           </w:tcPr>
           <w:p>
             <w:pPr>
-              <w:pStyle w:pstlname="Normal"/>
               <w:jc w:val="center"/>
               <w:pBdr>
                 <w:bottom w:val="none" w:sz="0" w:space="0" w:color="000000"/>
@@ -16109,7 +15974,6 @@
           </w:tcPr>
           <w:p>
             <w:pPr>
-              <w:pStyle w:pstlname="Normal"/>
               <w:jc w:val="center"/>
               <w:pBdr>
                 <w:bottom w:val="none" w:sz="0" w:space="0" w:color="000000"/>
@@ -16162,7 +16026,6 @@
           </w:tcPr>
           <w:p>
             <w:pPr>
-              <w:pStyle w:pstlname="Normal"/>
               <w:jc w:val="center"/>
               <w:pBdr>
                 <w:bottom w:val="none" w:sz="0" w:space="0" w:color="000000"/>
@@ -16215,7 +16078,6 @@
           </w:tcPr>
           <w:p>
             <w:pPr>
-              <w:pStyle w:pstlname="Normal"/>
               <w:jc w:val="center"/>
               <w:pBdr>
                 <w:bottom w:val="none" w:sz="0" w:space="0" w:color="000000"/>
@@ -16268,7 +16130,6 @@
           </w:tcPr>
           <w:p>
             <w:pPr>
-              <w:pStyle w:pstlname="Normal"/>
               <w:jc w:val="center"/>
               <w:pBdr>
                 <w:bottom w:val="none" w:sz="0" w:space="0" w:color="000000"/>
@@ -16327,7 +16188,6 @@
           </w:tcPr>
           <w:p>
             <w:pPr>
-              <w:pStyle w:pstlname="Normal"/>
               <w:jc w:val="center"/>
               <w:pBdr>
                 <w:bottom w:val="none" w:sz="0" w:space="0" w:color="000000"/>
@@ -16380,7 +16240,6 @@
           </w:tcPr>
           <w:p>
             <w:pPr>
-              <w:pStyle w:pstlname="Normal"/>
               <w:jc w:val="center"/>
               <w:pBdr>
                 <w:bottom w:val="none" w:sz="0" w:space="0" w:color="000000"/>
@@ -16433,7 +16292,6 @@
           </w:tcPr>
           <w:p>
             <w:pPr>
-              <w:pStyle w:pstlname="Normal"/>
               <w:jc w:val="center"/>
               <w:pBdr>
                 <w:bottom w:val="none" w:sz="0" w:space="0" w:color="000000"/>
@@ -16486,7 +16344,6 @@
           </w:tcPr>
           <w:p>
             <w:pPr>
-              <w:pStyle w:pstlname="Normal"/>
               <w:jc w:val="center"/>
               <w:pBdr>
                 <w:bottom w:val="none" w:sz="0" w:space="0" w:color="000000"/>
@@ -16539,7 +16396,6 @@
           </w:tcPr>
           <w:p>
             <w:pPr>
-              <w:pStyle w:pstlname="Normal"/>
               <w:jc w:val="center"/>
               <w:pBdr>
                 <w:bottom w:val="none" w:sz="0" w:space="0" w:color="000000"/>
@@ -16592,7 +16448,6 @@
           </w:tcPr>
           <w:p>
             <w:pPr>
-              <w:pStyle w:pstlname="Normal"/>
               <w:jc w:val="center"/>
               <w:pBdr>
                 <w:bottom w:val="none" w:sz="0" w:space="0" w:color="000000"/>
@@ -16645,7 +16500,6 @@
           </w:tcPr>
           <w:p>
             <w:pPr>
-              <w:pStyle w:pstlname="Normal"/>
               <w:jc w:val="center"/>
               <w:pBdr>
                 <w:bottom w:val="none" w:sz="0" w:space="0" w:color="000000"/>
@@ -16704,7 +16558,6 @@
           </w:tcPr>
           <w:p>
             <w:pPr>
-              <w:pStyle w:pstlname="Normal"/>
               <w:jc w:val="center"/>
               <w:pBdr>
                 <w:bottom w:val="none" w:sz="0" w:space="0" w:color="000000"/>
@@ -16757,7 +16610,6 @@
           </w:tcPr>
           <w:p>
             <w:pPr>
-              <w:pStyle w:pstlname="Normal"/>
               <w:jc w:val="center"/>
               <w:pBdr>
                 <w:bottom w:val="none" w:sz="0" w:space="0" w:color="000000"/>
@@ -16810,7 +16662,6 @@
           </w:tcPr>
           <w:p>
             <w:pPr>
-              <w:pStyle w:pstlname="Normal"/>
               <w:jc w:val="center"/>
               <w:pBdr>
                 <w:bottom w:val="none" w:sz="0" w:space="0" w:color="000000"/>
@@ -16863,7 +16714,6 @@
           </w:tcPr>
           <w:p>
             <w:pPr>
-              <w:pStyle w:pstlname="Normal"/>
               <w:jc w:val="center"/>
               <w:pBdr>
                 <w:bottom w:val="none" w:sz="0" w:space="0" w:color="000000"/>
@@ -16916,7 +16766,6 @@
           </w:tcPr>
           <w:p>
             <w:pPr>
-              <w:pStyle w:pstlname="Normal"/>
               <w:jc w:val="center"/>
               <w:pBdr>
                 <w:bottom w:val="none" w:sz="0" w:space="0" w:color="000000"/>
@@ -16969,7 +16818,6 @@
           </w:tcPr>
           <w:p>
             <w:pPr>
-              <w:pStyle w:pstlname="Normal"/>
               <w:jc w:val="center"/>
               <w:pBdr>
                 <w:bottom w:val="none" w:sz="0" w:space="0" w:color="000000"/>
@@ -17022,7 +16870,6 @@
           </w:tcPr>
           <w:p>
             <w:pPr>
-              <w:pStyle w:pstlname="Normal"/>
               <w:jc w:val="center"/>
               <w:pBdr>
                 <w:bottom w:val="none" w:sz="0" w:space="0" w:color="000000"/>
@@ -17081,7 +16928,6 @@
           </w:tcPr>
           <w:p>
             <w:pPr>
-              <w:pStyle w:pstlname="Normal"/>
               <w:jc w:val="center"/>
               <w:pBdr>
                 <w:bottom w:val="none" w:sz="0" w:space="0" w:color="000000"/>
@@ -17134,7 +16980,6 @@
           </w:tcPr>
           <w:p>
             <w:pPr>
-              <w:pStyle w:pstlname="Normal"/>
               <w:jc w:val="center"/>
               <w:pBdr>
                 <w:bottom w:val="none" w:sz="0" w:space="0" w:color="000000"/>
@@ -17187,7 +17032,6 @@
           </w:tcPr>
           <w:p>
             <w:pPr>
-              <w:pStyle w:pstlname="Normal"/>
               <w:jc w:val="center"/>
               <w:pBdr>
                 <w:bottom w:val="none" w:sz="0" w:space="0" w:color="000000"/>
@@ -17240,7 +17084,6 @@
           </w:tcPr>
           <w:p>
             <w:pPr>
-              <w:pStyle w:pstlname="Normal"/>
               <w:jc w:val="center"/>
               <w:pBdr>
                 <w:bottom w:val="none" w:sz="0" w:space="0" w:color="000000"/>
@@ -17293,7 +17136,6 @@
           </w:tcPr>
           <w:p>
             <w:pPr>
-              <w:pStyle w:pstlname="Normal"/>
               <w:jc w:val="center"/>
               <w:pBdr>
                 <w:bottom w:val="none" w:sz="0" w:space="0" w:color="000000"/>
@@ -17346,7 +17188,6 @@
           </w:tcPr>
           <w:p>
             <w:pPr>
-              <w:pStyle w:pstlname="Normal"/>
               <w:jc w:val="center"/>
               <w:pBdr>
                 <w:bottom w:val="none" w:sz="0" w:space="0" w:color="000000"/>
@@ -17399,7 +17240,6 @@
           </w:tcPr>
           <w:p>
             <w:pPr>
-              <w:pStyle w:pstlname="Normal"/>
               <w:jc w:val="center"/>
               <w:pBdr>
                 <w:bottom w:val="none" w:sz="0" w:space="0" w:color="000000"/>
@@ -17435,7 +17275,7 @@
         </w:tc>
       </w:tr>
     </w:tbl>
-    <w:bookmarkEnd w:id="182"/>
+    <w:bookmarkEnd w:id="179"/>
     <w:p>
       <w:pPr>
         <w:pStyle w:val="FigureNote"/>
@@ -17504,7 +17344,7 @@
         <w:br w:type="page"/>
       </w:r>
     </w:p>
-    <w:bookmarkStart w:id="183" w:name="tbl-osmasem-summary2"/>
+    <w:bookmarkStart w:id="180" w:name="tbl-osmasem-summary2"/>
     <w:p>
       <w:pPr>
         <w:pStyle w:val="FigureTitle"/>
@@ -17561,7 +17401,6 @@
           </w:tcPr>
           <w:p>
             <w:pPr>
-              <w:pStyle w:pstlname="Normal"/>
               <w:jc w:val="center"/>
               <w:pBdr>
                 <w:bottom w:val="none" w:sz="0" w:space="0" w:color="000000"/>
@@ -17614,7 +17453,6 @@
           </w:tcPr>
           <w:p>
             <w:pPr>
-              <w:pStyle w:pstlname="Normal"/>
               <w:jc w:val="center"/>
               <w:pBdr>
                 <w:bottom w:val="none" w:sz="0" w:space="0" w:color="000000"/>
@@ -17667,7 +17505,6 @@
           </w:tcPr>
           <w:p>
             <w:pPr>
-              <w:pStyle w:pstlname="Normal"/>
               <w:jc w:val="center"/>
               <w:pBdr>
                 <w:bottom w:val="none" w:sz="0" w:space="0" w:color="000000"/>
@@ -17720,7 +17557,6 @@
           </w:tcPr>
           <w:p>
             <w:pPr>
-              <w:pStyle w:pstlname="Normal"/>
               <w:jc w:val="center"/>
               <w:pBdr>
                 <w:bottom w:val="none" w:sz="0" w:space="0" w:color="000000"/>
@@ -17773,7 +17609,6 @@
           </w:tcPr>
           <w:p>
             <w:pPr>
-              <w:pStyle w:pstlname="Normal"/>
               <w:jc w:val="center"/>
               <w:pBdr>
                 <w:bottom w:val="none" w:sz="0" w:space="0" w:color="000000"/>
@@ -17826,7 +17661,6 @@
           </w:tcPr>
           <w:p>
             <w:pPr>
-              <w:pStyle w:pstlname="Normal"/>
               <w:jc w:val="center"/>
               <w:pBdr>
                 <w:bottom w:val="none" w:sz="0" w:space="0" w:color="000000"/>
@@ -17879,7 +17713,6 @@
           </w:tcPr>
           <w:p>
             <w:pPr>
-              <w:pStyle w:pstlname="Normal"/>
               <w:jc w:val="center"/>
               <w:pBdr>
                 <w:bottom w:val="none" w:sz="0" w:space="0" w:color="000000"/>
@@ -17938,7 +17771,6 @@
           </w:tcPr>
           <w:p>
             <w:pPr>
-              <w:pStyle w:pstlname="Normal"/>
               <w:jc w:val="center"/>
               <w:pBdr>
                 <w:bottom w:val="none" w:sz="0" w:space="0" w:color="000000"/>
@@ -17991,7 +17823,6 @@
           </w:tcPr>
           <w:p>
             <w:pPr>
-              <w:pStyle w:pstlname="Normal"/>
               <w:jc w:val="center"/>
               <w:pBdr>
                 <w:bottom w:val="none" w:sz="0" w:space="0" w:color="000000"/>
@@ -18044,7 +17875,6 @@
           </w:tcPr>
           <w:p>
             <w:pPr>
-              <w:pStyle w:pstlname="Normal"/>
               <w:jc w:val="center"/>
               <w:pBdr>
                 <w:bottom w:val="none" w:sz="0" w:space="0" w:color="000000"/>
@@ -18097,7 +17927,6 @@
           </w:tcPr>
           <w:p>
             <w:pPr>
-              <w:pStyle w:pstlname="Normal"/>
               <w:jc w:val="center"/>
               <w:pBdr>
                 <w:bottom w:val="none" w:sz="0" w:space="0" w:color="000000"/>
@@ -18127,7 +17956,7 @@
                 <w:szCs w:val="20"/>
                 <w:color w:val="000000"/>
               </w:rPr>
-              <w:t xml:space="preserve">-0.054***</w:t>
+              <w:t xml:space="preserve">-0.055***</w:t>
             </w:r>
           </w:p>
         </w:tc>
@@ -18150,7 +17979,6 @@
           </w:tcPr>
           <w:p>
             <w:pPr>
-              <w:pStyle w:pstlname="Normal"/>
               <w:jc w:val="center"/>
               <w:pBdr>
                 <w:bottom w:val="none" w:sz="0" w:space="0" w:color="000000"/>
@@ -18203,7 +18031,6 @@
           </w:tcPr>
           <w:p>
             <w:pPr>
-              <w:pStyle w:pstlname="Normal"/>
               <w:jc w:val="center"/>
               <w:pBdr>
                 <w:bottom w:val="none" w:sz="0" w:space="0" w:color="000000"/>
@@ -18256,7 +18083,6 @@
           </w:tcPr>
           <w:p>
             <w:pPr>
-              <w:pStyle w:pstlname="Normal"/>
               <w:jc w:val="center"/>
               <w:pBdr>
                 <w:bottom w:val="none" w:sz="0" w:space="0" w:color="000000"/>
@@ -18286,7 +18112,7 @@
                 <w:szCs w:val="20"/>
                 <w:color w:val="000000"/>
               </w:rPr>
-              <w:t xml:space="preserve">-6.37</w:t>
+              <w:t xml:space="preserve">-6.41</w:t>
             </w:r>
           </w:p>
         </w:tc>
@@ -18315,7 +18141,6 @@
           </w:tcPr>
           <w:p>
             <w:pPr>
-              <w:pStyle w:pstlname="Normal"/>
               <w:jc w:val="center"/>
               <w:pBdr>
                 <w:bottom w:val="none" w:sz="0" w:space="0" w:color="000000"/>
@@ -18368,7 +18193,6 @@
           </w:tcPr>
           <w:p>
             <w:pPr>
-              <w:pStyle w:pstlname="Normal"/>
               <w:jc w:val="center"/>
               <w:pBdr>
                 <w:bottom w:val="none" w:sz="0" w:space="0" w:color="000000"/>
@@ -18421,7 +18245,6 @@
           </w:tcPr>
           <w:p>
             <w:pPr>
-              <w:pStyle w:pstlname="Normal"/>
               <w:jc w:val="center"/>
               <w:pBdr>
                 <w:bottom w:val="none" w:sz="0" w:space="0" w:color="000000"/>
@@ -18474,7 +18297,6 @@
           </w:tcPr>
           <w:p>
             <w:pPr>
-              <w:pStyle w:pstlname="Normal"/>
               <w:jc w:val="center"/>
               <w:pBdr>
                 <w:bottom w:val="none" w:sz="0" w:space="0" w:color="000000"/>
@@ -18504,7 +18326,7 @@
                 <w:szCs w:val="20"/>
                 <w:color w:val="000000"/>
               </w:rPr>
-              <w:t xml:space="preserve">-0.111***</w:t>
+              <w:t xml:space="preserve">-0.11***</w:t>
             </w:r>
           </w:p>
         </w:tc>
@@ -18527,7 +18349,6 @@
           </w:tcPr>
           <w:p>
             <w:pPr>
-              <w:pStyle w:pstlname="Normal"/>
               <w:jc w:val="center"/>
               <w:pBdr>
                 <w:bottom w:val="none" w:sz="0" w:space="0" w:color="000000"/>
@@ -18580,7 +18401,6 @@
           </w:tcPr>
           <w:p>
             <w:pPr>
-              <w:pStyle w:pstlname="Normal"/>
               <w:jc w:val="center"/>
               <w:pBdr>
                 <w:bottom w:val="none" w:sz="0" w:space="0" w:color="000000"/>
@@ -18633,7 +18453,6 @@
           </w:tcPr>
           <w:p>
             <w:pPr>
-              <w:pStyle w:pstlname="Normal"/>
               <w:jc w:val="center"/>
               <w:pBdr>
                 <w:bottom w:val="none" w:sz="0" w:space="0" w:color="000000"/>
@@ -18663,7 +18482,7 @@
                 <w:szCs w:val="20"/>
                 <w:color w:val="000000"/>
               </w:rPr>
-              <w:t xml:space="preserve">-12.90</w:t>
+              <w:t xml:space="preserve">-12.89</w:t>
             </w:r>
           </w:p>
         </w:tc>
@@ -18692,7 +18511,6 @@
           </w:tcPr>
           <w:p>
             <w:pPr>
-              <w:pStyle w:pstlname="Normal"/>
               <w:jc w:val="center"/>
               <w:pBdr>
                 <w:bottom w:val="none" w:sz="0" w:space="0" w:color="000000"/>
@@ -18745,7 +18563,6 @@
           </w:tcPr>
           <w:p>
             <w:pPr>
-              <w:pStyle w:pstlname="Normal"/>
               <w:jc w:val="center"/>
               <w:pBdr>
                 <w:bottom w:val="none" w:sz="0" w:space="0" w:color="000000"/>
@@ -18798,7 +18615,6 @@
           </w:tcPr>
           <w:p>
             <w:pPr>
-              <w:pStyle w:pstlname="Normal"/>
               <w:jc w:val="center"/>
               <w:pBdr>
                 <w:bottom w:val="none" w:sz="0" w:space="0" w:color="000000"/>
@@ -18851,7 +18667,6 @@
           </w:tcPr>
           <w:p>
             <w:pPr>
-              <w:pStyle w:pstlname="Normal"/>
               <w:jc w:val="center"/>
               <w:pBdr>
                 <w:bottom w:val="none" w:sz="0" w:space="0" w:color="000000"/>
@@ -18904,7 +18719,6 @@
           </w:tcPr>
           <w:p>
             <w:pPr>
-              <w:pStyle w:pstlname="Normal"/>
               <w:jc w:val="center"/>
               <w:pBdr>
                 <w:bottom w:val="none" w:sz="0" w:space="0" w:color="000000"/>
@@ -18957,7 +18771,6 @@
           </w:tcPr>
           <w:p>
             <w:pPr>
-              <w:pStyle w:pstlname="Normal"/>
               <w:jc w:val="center"/>
               <w:pBdr>
                 <w:bottom w:val="none" w:sz="0" w:space="0" w:color="000000"/>
@@ -19010,7 +18823,6 @@
           </w:tcPr>
           <w:p>
             <w:pPr>
-              <w:pStyle w:pstlname="Normal"/>
               <w:jc w:val="center"/>
               <w:pBdr>
                 <w:bottom w:val="none" w:sz="0" w:space="0" w:color="000000"/>
@@ -19069,7 +18881,6 @@
           </w:tcPr>
           <w:p>
             <w:pPr>
-              <w:pStyle w:pstlname="Normal"/>
               <w:jc w:val="center"/>
               <w:pBdr>
                 <w:bottom w:val="none" w:sz="0" w:space="0" w:color="000000"/>
@@ -19122,7 +18933,6 @@
           </w:tcPr>
           <w:p>
             <w:pPr>
-              <w:pStyle w:pstlname="Normal"/>
               <w:jc w:val="center"/>
               <w:pBdr>
                 <w:bottom w:val="none" w:sz="0" w:space="0" w:color="000000"/>
@@ -19175,7 +18985,6 @@
           </w:tcPr>
           <w:p>
             <w:pPr>
-              <w:pStyle w:pstlname="Normal"/>
               <w:jc w:val="center"/>
               <w:pBdr>
                 <w:bottom w:val="none" w:sz="0" w:space="0" w:color="000000"/>
@@ -19228,7 +19037,6 @@
           </w:tcPr>
           <w:p>
             <w:pPr>
-              <w:pStyle w:pstlname="Normal"/>
               <w:jc w:val="center"/>
               <w:pBdr>
                 <w:bottom w:val="none" w:sz="0" w:space="0" w:color="000000"/>
@@ -19281,7 +19089,6 @@
           </w:tcPr>
           <w:p>
             <w:pPr>
-              <w:pStyle w:pstlname="Normal"/>
               <w:jc w:val="center"/>
               <w:pBdr>
                 <w:bottom w:val="none" w:sz="0" w:space="0" w:color="000000"/>
@@ -19334,7 +19141,6 @@
           </w:tcPr>
           <w:p>
             <w:pPr>
-              <w:pStyle w:pstlname="Normal"/>
               <w:jc w:val="center"/>
               <w:pBdr>
                 <w:bottom w:val="none" w:sz="0" w:space="0" w:color="000000"/>
@@ -19387,7 +19193,6 @@
           </w:tcPr>
           <w:p>
             <w:pPr>
-              <w:pStyle w:pstlname="Normal"/>
               <w:jc w:val="center"/>
               <w:pBdr>
                 <w:bottom w:val="none" w:sz="0" w:space="0" w:color="000000"/>
@@ -19417,7 +19222,7 @@
                 <w:szCs w:val="20"/>
                 <w:color w:val="000000"/>
               </w:rPr>
-              <w:t xml:space="preserve">28.84</w:t>
+              <w:t xml:space="preserve">28.88</w:t>
             </w:r>
           </w:p>
         </w:tc>
@@ -19446,7 +19251,6 @@
           </w:tcPr>
           <w:p>
             <w:pPr>
-              <w:pStyle w:pstlname="Normal"/>
               <w:jc w:val="center"/>
               <w:pBdr>
                 <w:bottom w:val="none" w:sz="0" w:space="0" w:color="000000"/>
@@ -19499,7 +19303,6 @@
           </w:tcPr>
           <w:p>
             <w:pPr>
-              <w:pStyle w:pstlname="Normal"/>
               <w:jc w:val="center"/>
               <w:pBdr>
                 <w:bottom w:val="none" w:sz="0" w:space="0" w:color="000000"/>
@@ -19552,7 +19355,6 @@
           </w:tcPr>
           <w:p>
             <w:pPr>
-              <w:pStyle w:pstlname="Normal"/>
               <w:jc w:val="center"/>
               <w:pBdr>
                 <w:bottom w:val="none" w:sz="0" w:space="0" w:color="000000"/>
@@ -19605,7 +19407,6 @@
           </w:tcPr>
           <w:p>
             <w:pPr>
-              <w:pStyle w:pstlname="Normal"/>
               <w:jc w:val="center"/>
               <w:pBdr>
                 <w:bottom w:val="none" w:sz="0" w:space="0" w:color="000000"/>
@@ -19658,7 +19459,6 @@
           </w:tcPr>
           <w:p>
             <w:pPr>
-              <w:pStyle w:pstlname="Normal"/>
               <w:jc w:val="center"/>
               <w:pBdr>
                 <w:bottom w:val="none" w:sz="0" w:space="0" w:color="000000"/>
@@ -19711,7 +19511,6 @@
           </w:tcPr>
           <w:p>
             <w:pPr>
-              <w:pStyle w:pstlname="Normal"/>
               <w:jc w:val="center"/>
               <w:pBdr>
                 <w:bottom w:val="none" w:sz="0" w:space="0" w:color="000000"/>
@@ -19764,7 +19563,6 @@
           </w:tcPr>
           <w:p>
             <w:pPr>
-              <w:pStyle w:pstlname="Normal"/>
               <w:jc w:val="center"/>
               <w:pBdr>
                 <w:bottom w:val="none" w:sz="0" w:space="0" w:color="000000"/>
@@ -19800,7 +19598,7 @@
         </w:tc>
       </w:tr>
     </w:tbl>
-    <w:bookmarkEnd w:id="183"/>
+    <w:bookmarkEnd w:id="180"/>
     <w:p>
       <w:pPr>
         <w:pStyle w:val="FigureNote"/>
@@ -19869,7 +19667,7 @@
         <w:br w:type="page"/>
       </w:r>
     </w:p>
-    <w:bookmarkStart w:id="187" w:name="fig-prisma"/>
+    <w:bookmarkStart w:id="184" w:name="fig-prisma"/>
     <w:p>
       <w:pPr>
         <w:pStyle w:val="FigureTitle"/>
@@ -19895,18 +19693,18 @@
           <wp:inline>
             <wp:extent cx="5943600" cy="5943600"/>
             <wp:effectExtent b="0" l="0" r="0" t="0"/>
-            <wp:docPr descr="" title="" id="185" name="Picture"/>
+            <wp:docPr descr="" title="" id="182" name="Picture"/>
             <a:graphic>
               <a:graphicData uri="http://schemas.openxmlformats.org/drawingml/2006/picture">
                 <pic:pic>
                   <pic:nvPicPr>
-                    <pic:cNvPr descr="prisma.png" id="186" name="Picture"/>
+                    <pic:cNvPr descr="prisma.png" id="183" name="Picture"/>
                     <pic:cNvPicPr>
                       <a:picLocks noChangeArrowheads="1" noChangeAspect="1"/>
                     </pic:cNvPicPr>
                   </pic:nvPicPr>
                   <pic:blipFill>
-                    <a:blip r:embed="rId184"/>
+                    <a:blip r:embed="rId181"/>
                     <a:stretch>
                       <a:fillRect/>
                     </a:stretch>
@@ -19933,13 +19731,13 @@
         </w:drawing>
       </w:r>
     </w:p>
-    <w:bookmarkEnd w:id="187"/>
+    <w:bookmarkEnd w:id="184"/>
     <w:p>
       <w:r>
         <w:br w:type="page"/>
       </w:r>
     </w:p>
-    <w:bookmarkStart w:id="191" w:name="fig-meta-analysis-plot"/>
+    <w:bookmarkStart w:id="188" w:name="fig-meta-analysis-plot"/>
     <w:p>
       <w:pPr>
         <w:pStyle w:val="FigureTitle"/>
@@ -19965,18 +19763,18 @@
           <wp:inline>
             <wp:extent cx="5943600" cy="5943600"/>
             <wp:effectExtent b="0" l="0" r="0" t="0"/>
-            <wp:docPr descr="" title="" id="189" name="Picture"/>
+            <wp:docPr descr="" title="" id="186" name="Picture"/>
             <a:graphic>
               <a:graphicData uri="http://schemas.openxmlformats.org/drawingml/2006/picture">
                 <pic:pic>
                   <pic:nvPicPr>
-                    <pic:cNvPr descr="livingSEBpaper_files/figure-docx/fig-meta-analysis-plot-1.png" id="190" name="Picture"/>
+                    <pic:cNvPr descr="livingSEBpaper_files/figure-docx/fig-meta-analysis-plot-1.png" id="187" name="Picture"/>
                     <pic:cNvPicPr>
                       <a:picLocks noChangeArrowheads="1" noChangeAspect="1"/>
                     </pic:cNvPicPr>
                   </pic:nvPicPr>
                   <pic:blipFill>
-                    <a:blip r:embed="rId188"/>
+                    <a:blip r:embed="rId185"/>
                     <a:stretch>
                       <a:fillRect/>
                     </a:stretch>
@@ -20003,13 +19801,13 @@
         </w:drawing>
       </w:r>
     </w:p>
-    <w:bookmarkEnd w:id="191"/>
+    <w:bookmarkEnd w:id="188"/>
     <w:p>
       <w:r>
         <w:br w:type="page"/>
       </w:r>
     </w:p>
-    <w:bookmarkStart w:id="195" w:name="fig-corrplot"/>
+    <w:bookmarkStart w:id="192" w:name="fig-corrplot"/>
     <w:p>
       <w:pPr>
         <w:pStyle w:val="FigureTitle"/>
@@ -20035,18 +19833,18 @@
           <wp:inline>
             <wp:extent cx="5943600" cy="5943600"/>
             <wp:effectExtent b="0" l="0" r="0" t="0"/>
-            <wp:docPr descr="" title="" id="193" name="Picture"/>
+            <wp:docPr descr="" title="" id="190" name="Picture"/>
             <a:graphic>
               <a:graphicData uri="http://schemas.openxmlformats.org/drawingml/2006/picture">
                 <pic:pic>
                   <pic:nvPicPr>
-                    <pic:cNvPr descr="livingSEBpaper_files/figure-docx/fig-corrplot-1.png" id="194" name="Picture"/>
+                    <pic:cNvPr descr="livingSEBpaper_files/figure-docx/fig-corrplot-1.png" id="191" name="Picture"/>
                     <pic:cNvPicPr>
                       <a:picLocks noChangeArrowheads="1" noChangeAspect="1"/>
                     </pic:cNvPicPr>
                   </pic:nvPicPr>
                   <pic:blipFill>
-                    <a:blip r:embed="rId192"/>
+                    <a:blip r:embed="rId189"/>
                     <a:stretch>
                       <a:fillRect/>
                     </a:stretch>
@@ -20073,13 +19871,13 @@
         </w:drawing>
       </w:r>
     </w:p>
-    <w:bookmarkEnd w:id="195"/>
+    <w:bookmarkEnd w:id="192"/>
     <w:p>
       <w:r>
         <w:br w:type="page"/>
       </w:r>
     </w:p>
-    <w:bookmarkEnd w:id="196"/>
+    <w:bookmarkEnd w:id="193"/>
     <w:sectPr>
       <w:headerReference r:id="rId9" w:type="even"/>
       <w:headerReference r:id="rId11" w:type="default"/>

</xml_diff>